<commit_message>
Bloques de vocabulario Palabras nuevas en las seis guias
</commit_message>
<xml_diff>
--- a/06-Evaluacion-final.docx
+++ b/06-Evaluacion-final.docx
@@ -2,7 +2,7 @@
 <file path=word/document.xml><?xml version="1.0" encoding="utf-8"?>
 <w:document xmlns:w="http://schemas.openxmlformats.org/wordprocessingml/2006/main" xmlns:m="http://schemas.openxmlformats.org/officeDocument/2006/math" xmlns:r="http://schemas.openxmlformats.org/officeDocument/2006/relationships" xmlns:o="urn:schemas-microsoft-com:office:office" xmlns:v="urn:schemas-microsoft-com:vml" xmlns:w10="urn:schemas-microsoft-com:office:word" xmlns:a="http://schemas.openxmlformats.org/drawingml/2006/main" xmlns:pic="http://schemas.openxmlformats.org/drawingml/2006/picture" xmlns:wp="http://schemas.openxmlformats.org/drawingml/2006/wordprocessingDrawing">
   <w:body>
-    <w:bookmarkStart w:id="16" w:name="evaluación-final-integrada"/>
+    <w:bookmarkStart w:id="32" w:name="evaluación-final-integrada"/>
     <w:p>
       <w:pPr>
         <w:pStyle w:val="Heading1"/>
@@ -17,8 +17,8 @@
       </w:pPr>
       <w:r>
         <w:rPr>
+          <w:bCs/>
           <w:b/>
-          <w:bCs/>
         </w:rPr>
         <w:t xml:space="preserve">Las cinco asignaturas · Semana 3</w:t>
       </w:r>
@@ -37,8 +37,8 @@
       </w:pPr>
       <w:r>
         <w:rPr>
+          <w:bCs/>
           <w:b/>
-          <w:bCs/>
         </w:rPr>
         <w:t xml:space="preserve">Instrucciones.</w:t>
       </w:r>
@@ -55,8 +55,8 @@
       </w:pPr>
       <w:r>
         <w:rPr>
+          <w:bCs/>
           <w:b/>
-          <w:bCs/>
         </w:rPr>
         <w:t xml:space="preserve">Tiempo sugerido:</w:t>
       </w:r>
@@ -73,8 +73,8 @@
       </w:pPr>
       <w:r>
         <w:rPr>
+          <w:bCs/>
           <w:b/>
-          <w:bCs/>
         </w:rPr>
         <w:t xml:space="preserve">Puntaje total:</w:t>
       </w:r>
@@ -92,7 +92,7 @@
         </w:pict>
       </w:r>
     </w:p>
-    <w:bookmarkStart w:id="9" w:name="parte-i-matemáticas-10-puntos"/>
+    <w:bookmarkStart w:id="21" w:name="parte-i-matemáticas-10-puntos"/>
     <w:p>
       <w:pPr>
         <w:pStyle w:val="Heading2"/>
@@ -101,13 +101,76 @@
         <w:t xml:space="preserve">Parte I · Matemáticas (10 puntos)</w:t>
       </w:r>
     </w:p>
-    <w:p>
-      <w:pPr>
-        <w:pStyle w:val="Compact"/>
+    <w:bookmarkStart w:id="20" w:name="palabras-nuevas"/>
+    <w:p>
+      <w:pPr>
+        <w:pStyle w:val="Heading4"/>
+      </w:pPr>
+      <w:r>
+        <w:t xml:space="preserve">📖 Palabras nuevas</w:t>
+      </w:r>
+    </w:p>
+    <w:p>
+      <w:pPr>
+        <w:pStyle w:val="FirstParagraph"/>
+      </w:pPr>
+      <w:r>
+        <w:rPr>
+          <w:bCs/>
+          <w:b/>
+        </w:rPr>
+        <w:t xml:space="preserve">Valor posicional.</w:t>
+      </w:r>
+      <w:r>
+        <w:t xml:space="preserve"> </w:t>
+      </w:r>
+      <w:r>
+        <w:t xml:space="preserve">Lo que vale un dígito según el lugar que ocupa en el número. En 947.302 el 4 está en las decenas de mil, así que vale 40.000.</w:t>
+      </w:r>
+    </w:p>
+    <w:p>
+      <w:pPr>
+        <w:pStyle w:val="BodyText"/>
+      </w:pPr>
+      <w:r>
+        <w:rPr>
+          <w:bCs/>
+          <w:b/>
+        </w:rPr>
+        <w:t xml:space="preserve">Número mixto.</w:t>
+      </w:r>
+      <w:r>
+        <w:t xml:space="preserve"> </w:t>
+      </w:r>
+      <w:r>
+        <w:t xml:space="preserve">Un número que tiene una parte entera y una fracción juntas, como 3 5/8, que se lee «tres enteros y cinco octavos».</w:t>
+      </w:r>
+    </w:p>
+    <w:p>
+      <w:pPr>
+        <w:pStyle w:val="BodyText"/>
+      </w:pPr>
+      <w:r>
+        <w:rPr>
+          <w:bCs/>
+          <w:b/>
+        </w:rPr>
+        <w:t xml:space="preserve">Simplificar.</w:t>
+      </w:r>
+      <w:r>
+        <w:t xml:space="preserve"> </w:t>
+      </w:r>
+      <w:r>
+        <w:t xml:space="preserve">Dejar una fracción con los números más chicos posibles sin cambiar su valor. 2/6 simplificado es 1/3.</w:t>
+      </w:r>
+    </w:p>
+    <w:p>
+      <w:pPr>
         <w:numPr>
           <w:ilvl w:val="0"/>
           <w:numId w:val="1001"/>
         </w:numPr>
+        <w:pStyle w:val="Compact"/>
       </w:pPr>
       <w:r>
         <w:t xml:space="preserve">Escribe con palabras el número 525.408.</w:t>
@@ -115,11 +178,11 @@
     </w:p>
     <w:p>
       <w:pPr>
-        <w:pStyle w:val="Compact"/>
         <w:numPr>
           <w:ilvl w:val="0"/>
           <w:numId w:val="1001"/>
         </w:numPr>
+        <w:pStyle w:val="Compact"/>
       </w:pPr>
       <w:r>
         <w:t xml:space="preserve">¿Qué valor posicional tiene el 4 en 947.302?</w:t>
@@ -127,11 +190,11 @@
     </w:p>
     <w:p>
       <w:pPr>
-        <w:pStyle w:val="Compact"/>
         <w:numPr>
           <w:ilvl w:val="0"/>
           <w:numId w:val="1001"/>
         </w:numPr>
+        <w:pStyle w:val="Compact"/>
       </w:pPr>
       <w:r>
         <w:t xml:space="preserve">Calcula 1.807 × 45.</w:t>
@@ -139,11 +202,11 @@
     </w:p>
     <w:p>
       <w:pPr>
-        <w:pStyle w:val="Compact"/>
         <w:numPr>
           <w:ilvl w:val="0"/>
           <w:numId w:val="1001"/>
         </w:numPr>
+        <w:pStyle w:val="Compact"/>
       </w:pPr>
       <w:r>
         <w:t xml:space="preserve">Calcula 20.475 ÷ 25.</w:t>
@@ -151,11 +214,11 @@
     </w:p>
     <w:p>
       <w:pPr>
-        <w:pStyle w:val="Compact"/>
         <w:numPr>
           <w:ilvl w:val="0"/>
           <w:numId w:val="1001"/>
         </w:numPr>
+        <w:pStyle w:val="Compact"/>
       </w:pPr>
       <w:r>
         <w:t xml:space="preserve">Transforma 29/8 a número mixto.</w:t>
@@ -163,11 +226,11 @@
     </w:p>
     <w:p>
       <w:pPr>
-        <w:pStyle w:val="Compact"/>
         <w:numPr>
           <w:ilvl w:val="0"/>
           <w:numId w:val="1001"/>
         </w:numPr>
+        <w:pStyle w:val="Compact"/>
       </w:pPr>
       <w:r>
         <w:t xml:space="preserve">Calcula 3/5 + 3/10 y simplifica si es posible.</w:t>
@@ -175,11 +238,11 @@
     </w:p>
     <w:p>
       <w:pPr>
-        <w:pStyle w:val="Compact"/>
         <w:numPr>
           <w:ilvl w:val="0"/>
           <w:numId w:val="1001"/>
         </w:numPr>
+        <w:pStyle w:val="Compact"/>
       </w:pPr>
       <w:r>
         <w:t xml:space="preserve">Calcula 5/6 − 1/2 y simplifica si es posible.</w:t>
@@ -187,11 +250,11 @@
     </w:p>
     <w:p>
       <w:pPr>
-        <w:pStyle w:val="Compact"/>
         <w:numPr>
           <w:ilvl w:val="0"/>
           <w:numId w:val="1001"/>
         </w:numPr>
+        <w:pStyle w:val="Compact"/>
       </w:pPr>
       <w:r>
         <w:t xml:space="preserve">Ordena de menor a mayor: 2,07 · 2,7 · 2,007 · 2,077</w:t>
@@ -199,11 +262,11 @@
     </w:p>
     <w:p>
       <w:pPr>
-        <w:pStyle w:val="Compact"/>
         <w:numPr>
           <w:ilvl w:val="0"/>
           <w:numId w:val="1001"/>
         </w:numPr>
+        <w:pStyle w:val="Compact"/>
       </w:pPr>
       <w:r>
         <w:t xml:space="preserve">Calcula 30 − 12,45.</w:t>
@@ -211,11 +274,11 @@
     </w:p>
     <w:p>
       <w:pPr>
-        <w:pStyle w:val="Compact"/>
         <w:numPr>
           <w:ilvl w:val="0"/>
           <w:numId w:val="1001"/>
         </w:numPr>
+        <w:pStyle w:val="Compact"/>
       </w:pPr>
       <w:r>
         <w:t xml:space="preserve">Un barco recorre 148 km cada día. ¿Cuántos kilómetros recorre en 36 días?</w:t>
@@ -228,8 +291,9 @@
         </w:pict>
       </w:r>
     </w:p>
-    <w:bookmarkEnd w:id="9"/>
-    <w:bookmarkStart w:id="11" w:name="Xf1fe187a32308a4a5fafcdf99f032e0b2b1978c"/>
+    <w:bookmarkEnd w:id="20"/>
+    <w:bookmarkEnd w:id="21"/>
+    <w:bookmarkStart w:id="24" w:name="Xf1fe187a32308a4a5fafcdf99f032e0b2b1978c"/>
     <w:p>
       <w:pPr>
         <w:pStyle w:val="Heading2"/>
@@ -238,19 +302,101 @@
         <w:t xml:space="preserve">Parte II · Lenguaje y Comunicación (10 puntos)</w:t>
       </w:r>
     </w:p>
+    <w:bookmarkStart w:id="22" w:name="palabras-nuevas-1"/>
+    <w:p>
+      <w:pPr>
+        <w:pStyle w:val="Heading4"/>
+      </w:pPr>
+      <w:r>
+        <w:t xml:space="preserve">📖 Palabras nuevas</w:t>
+      </w:r>
+    </w:p>
     <w:p>
       <w:pPr>
         <w:pStyle w:val="FirstParagraph"/>
       </w:pPr>
       <w:r>
         <w:rPr>
+          <w:bCs/>
           <w:b/>
+        </w:rPr>
+        <w:t xml:space="preserve">Estrofa.</w:t>
+      </w:r>
+      <w:r>
+        <w:t xml:space="preserve"> </w:t>
+      </w:r>
+      <w:r>
+        <w:t xml:space="preserve">Un bloque de versos separado de los demás por un espacio, como un párrafo del poema.</w:t>
+      </w:r>
+    </w:p>
+    <w:p>
+      <w:pPr>
+        <w:pStyle w:val="BodyText"/>
+      </w:pPr>
+      <w:r>
+        <w:rPr>
           <w:bCs/>
+          <w:b/>
+        </w:rPr>
+        <w:t xml:space="preserve">Rima consonante.</w:t>
+      </w:r>
+      <w:r>
+        <w:t xml:space="preserve"> </w:t>
+      </w:r>
+      <w:r>
+        <w:t xml:space="preserve">Cuando dos palabras suenan igual desde la última vocal acentuada, con vocales y consonantes: país / gris. Si solo coinciden las vocales, es asonante.</w:t>
+      </w:r>
+    </w:p>
+    <w:p>
+      <w:pPr>
+        <w:pStyle w:val="BodyText"/>
+      </w:pPr>
+      <w:r>
+        <w:rPr>
+          <w:bCs/>
+          <w:b/>
+        </w:rPr>
+        <w:t xml:space="preserve">Hablante lírico.</w:t>
+      </w:r>
+      <w:r>
+        <w:t xml:space="preserve"> </w:t>
+      </w:r>
+      <w:r>
+        <w:t xml:space="preserve">La voz que habla dentro del poema, el «yo» que cuenta lo que siente. No es la persona que lo escribió.</w:t>
+      </w:r>
+    </w:p>
+    <w:p>
+      <w:pPr>
+        <w:pStyle w:val="BodyText"/>
+      </w:pPr>
+      <w:r>
+        <w:rPr>
+          <w:bCs/>
+          <w:b/>
+        </w:rPr>
+        <w:t xml:space="preserve">Motivo lírico.</w:t>
+      </w:r>
+      <w:r>
+        <w:t xml:space="preserve"> </w:t>
+      </w:r>
+      <w:r>
+        <w:t xml:space="preserve">La idea o el sentimiento que mueve el poema, lo que el hablante quiere transmitir.</w:t>
+      </w:r>
+    </w:p>
+    <w:p>
+      <w:pPr>
+        <w:pStyle w:val="BodyText"/>
+      </w:pPr>
+      <w:r>
+        <w:rPr>
+          <w:bCs/>
+          <w:b/>
         </w:rPr>
         <w:t xml:space="preserve">Lee este poema original y responde.</w:t>
       </w:r>
     </w:p>
-    <w:bookmarkStart w:id="10" w:name="mapa-viejo"/>
+    <w:bookmarkEnd w:id="22"/>
+    <w:bookmarkStart w:id="23" w:name="mapa-viejo"/>
     <w:p>
       <w:pPr>
         <w:pStyle w:val="Heading3"/>
@@ -313,11 +459,11 @@
     </w:p>
     <w:p>
       <w:pPr>
-        <w:pStyle w:val="Compact"/>
         <w:numPr>
           <w:ilvl w:val="0"/>
           <w:numId w:val="1002"/>
         </w:numPr>
+        <w:pStyle w:val="Compact"/>
       </w:pPr>
       <w:r>
         <w:t xml:space="preserve">¿Cuántas estrofas y cuántos versos tiene el poema?</w:t>
@@ -325,11 +471,11 @@
     </w:p>
     <w:p>
       <w:pPr>
-        <w:pStyle w:val="Compact"/>
         <w:numPr>
           <w:ilvl w:val="0"/>
           <w:numId w:val="1002"/>
         </w:numPr>
+        <w:pStyle w:val="Compact"/>
       </w:pPr>
       <w:r>
         <w:t xml:space="preserve">¿Qué palabras riman en cada estrofa? ¿La rima es consonante o asonante?</w:t>
@@ -337,11 +483,11 @@
     </w:p>
     <w:p>
       <w:pPr>
-        <w:pStyle w:val="Compact"/>
         <w:numPr>
           <w:ilvl w:val="0"/>
           <w:numId w:val="1002"/>
         </w:numPr>
+        <w:pStyle w:val="Compact"/>
       </w:pPr>
       <w:r>
         <w:t xml:space="preserve">¿Quién es el hablante lírico?</w:t>
@@ -349,11 +495,11 @@
     </w:p>
     <w:p>
       <w:pPr>
-        <w:pStyle w:val="Compact"/>
         <w:numPr>
           <w:ilvl w:val="0"/>
           <w:numId w:val="1002"/>
         </w:numPr>
+        <w:pStyle w:val="Compact"/>
       </w:pPr>
       <w:r>
         <w:t xml:space="preserve">¿Cuál es el objeto lírico?</w:t>
@@ -361,11 +507,11 @@
     </w:p>
     <w:p>
       <w:pPr>
-        <w:pStyle w:val="Compact"/>
         <w:numPr>
           <w:ilvl w:val="0"/>
           <w:numId w:val="1002"/>
         </w:numPr>
+        <w:pStyle w:val="Compact"/>
       </w:pPr>
       <w:r>
         <w:t xml:space="preserve">¿Cuál es el motivo lírico? Explícalo en una oración.</w:t>
@@ -373,11 +519,11 @@
     </w:p>
     <w:p>
       <w:pPr>
-        <w:pStyle w:val="Compact"/>
         <w:numPr>
           <w:ilvl w:val="0"/>
           <w:numId w:val="1002"/>
         </w:numPr>
+        <w:pStyle w:val="Compact"/>
       </w:pPr>
       <w:r>
         <w:t xml:space="preserve">¿Qué figura literaria hay en</w:t>
@@ -386,7 +532,13 @@
         <w:t xml:space="preserve"> </w:t>
       </w:r>
       <w:r>
-        <w:t xml:space="preserve">“las montañas son arrugas”</w:t>
+        <w:t xml:space="preserve">“</w:t>
+      </w:r>
+      <w:r>
+        <w:t xml:space="preserve">las montañas son arrugas</w:t>
+      </w:r>
+      <w:r>
+        <w:t xml:space="preserve">”</w:t>
       </w:r>
       <w:r>
         <w:t xml:space="preserve">?</w:t>
@@ -394,11 +546,11 @@
     </w:p>
     <w:p>
       <w:pPr>
-        <w:pStyle w:val="Compact"/>
         <w:numPr>
           <w:ilvl w:val="0"/>
           <w:numId w:val="1002"/>
         </w:numPr>
+        <w:pStyle w:val="Compact"/>
       </w:pPr>
       <w:r>
         <w:t xml:space="preserve">¿Qué figura literaria hay en</w:t>
@@ -407,7 +559,13 @@
         <w:t xml:space="preserve"> </w:t>
       </w:r>
       <w:r>
-        <w:t xml:space="preserve">“el papel, que estaba triste, amanece”</w:t>
+        <w:t xml:space="preserve">“</w:t>
+      </w:r>
+      <w:r>
+        <w:t xml:space="preserve">el papel, que estaba triste, amanece</w:t>
+      </w:r>
+      <w:r>
+        <w:t xml:space="preserve">”</w:t>
       </w:r>
       <w:r>
         <w:t xml:space="preserve">?</w:t>
@@ -415,11 +573,11 @@
     </w:p>
     <w:p>
       <w:pPr>
-        <w:pStyle w:val="Compact"/>
         <w:numPr>
           <w:ilvl w:val="0"/>
           <w:numId w:val="1002"/>
         </w:numPr>
+        <w:pStyle w:val="Compact"/>
       </w:pPr>
       <w:r>
         <w:t xml:space="preserve">¿A qué género literario pertenece este texto? Justifica con dos características.</w:t>
@@ -427,11 +585,11 @@
     </w:p>
     <w:p>
       <w:pPr>
-        <w:pStyle w:val="Compact"/>
         <w:numPr>
           <w:ilvl w:val="0"/>
           <w:numId w:val="1002"/>
         </w:numPr>
+        <w:pStyle w:val="Compact"/>
       </w:pPr>
       <w:r>
         <w:t xml:space="preserve">Explica con un ejemplo la diferencia entre metáfora y comparación.</w:t>
@@ -439,11 +597,11 @@
     </w:p>
     <w:p>
       <w:pPr>
-        <w:pStyle w:val="Compact"/>
         <w:numPr>
           <w:ilvl w:val="0"/>
           <w:numId w:val="1002"/>
         </w:numPr>
+        <w:pStyle w:val="Compact"/>
       </w:pPr>
       <w:r>
         <w:t xml:space="preserve">Escribe una comparación original sobre un mapa.</w:t>
@@ -456,9 +614,9 @@
         </w:pict>
       </w:r>
     </w:p>
-    <w:bookmarkEnd w:id="10"/>
-    <w:bookmarkEnd w:id="11"/>
-    <w:bookmarkStart w:id="12" w:name="parte-iii-ciencias-naturales-10-puntos"/>
+    <w:bookmarkEnd w:id="23"/>
+    <w:bookmarkEnd w:id="24"/>
+    <w:bookmarkStart w:id="26" w:name="parte-iii-ciencias-naturales-10-puntos"/>
     <w:p>
       <w:pPr>
         <w:pStyle w:val="Heading2"/>
@@ -467,13 +625,94 @@
         <w:t xml:space="preserve">Parte III · Ciencias Naturales (10 puntos)</w:t>
       </w:r>
     </w:p>
-    <w:p>
-      <w:pPr>
-        <w:pStyle w:val="Compact"/>
+    <w:bookmarkStart w:id="25" w:name="palabras-nuevas-2"/>
+    <w:p>
+      <w:pPr>
+        <w:pStyle w:val="Heading4"/>
+      </w:pPr>
+      <w:r>
+        <w:t xml:space="preserve">📖 Palabras nuevas</w:t>
+      </w:r>
+    </w:p>
+    <w:p>
+      <w:pPr>
+        <w:pStyle w:val="FirstParagraph"/>
+      </w:pPr>
+      <w:r>
+        <w:rPr>
+          <w:bCs/>
+          <w:b/>
+        </w:rPr>
+        <w:t xml:space="preserve">Sello de advertencia.</w:t>
+      </w:r>
+      <w:r>
+        <w:t xml:space="preserve"> </w:t>
+      </w:r>
+      <w:r>
+        <w:t xml:space="preserve">Los octógonos negros de los envases que avisan «ALTO EN AZÚCARES» o «ALTO EN SODIO». Advertir es avisar de algo malo.</w:t>
+      </w:r>
+    </w:p>
+    <w:p>
+      <w:pPr>
+        <w:pStyle w:val="BodyText"/>
+      </w:pPr>
+      <w:r>
+        <w:rPr>
+          <w:bCs/>
+          <w:b/>
+        </w:rPr>
+        <w:t xml:space="preserve">Alquitrán.</w:t>
+      </w:r>
+      <w:r>
+        <w:t xml:space="preserve"> </w:t>
+      </w:r>
+      <w:r>
+        <w:t xml:space="preserve">Una sustancia negra y pegajosa del humo del cigarro, parecida a la del asfalto, que se pega dentro de los pulmones.</w:t>
+      </w:r>
+    </w:p>
+    <w:p>
+      <w:pPr>
+        <w:pStyle w:val="BodyText"/>
+      </w:pPr>
+      <w:r>
+        <w:rPr>
+          <w:bCs/>
+          <w:b/>
+        </w:rPr>
+        <w:t xml:space="preserve">Monóxido de carbono.</w:t>
+      </w:r>
+      <w:r>
+        <w:t xml:space="preserve"> </w:t>
+      </w:r>
+      <w:r>
+        <w:t xml:space="preserve">Un gas invisible del humo del cigarro que le quita el puesto al oxígeno en la sangre, así que el corazón tiene que trabajar más.</w:t>
+      </w:r>
+    </w:p>
+    <w:p>
+      <w:pPr>
+        <w:pStyle w:val="BodyText"/>
+      </w:pPr>
+      <w:r>
+        <w:rPr>
+          <w:bCs/>
+          <w:b/>
+        </w:rPr>
+        <w:t xml:space="preserve">Fumador pasivo.</w:t>
+      </w:r>
+      <w:r>
+        <w:t xml:space="preserve"> </w:t>
+      </w:r>
+      <w:r>
+        <w:t xml:space="preserve">Quien respira el humo del cigarro de otras personas sin fumar. «Pasivo» aquí quiere decir que le pasa sin que él haga nada.</w:t>
+      </w:r>
+    </w:p>
+    <w:p>
+      <w:pPr>
         <w:numPr>
           <w:ilvl w:val="0"/>
           <w:numId w:val="1003"/>
         </w:numPr>
+        <w:pStyle w:val="Compact"/>
       </w:pPr>
       <w:r>
         <w:t xml:space="preserve">Nombra los cinco pilares de una vida saludable.</w:t>
@@ -481,11 +720,11 @@
     </w:p>
     <w:p>
       <w:pPr>
-        <w:pStyle w:val="Compact"/>
         <w:numPr>
           <w:ilvl w:val="0"/>
           <w:numId w:val="1003"/>
         </w:numPr>
+        <w:pStyle w:val="Compact"/>
       </w:pPr>
       <w:r>
         <w:t xml:space="preserve">¿Qué fracción del plato deben ocupar las verduras y frutas? ¿Y las proteínas?</w:t>
@@ -493,11 +732,11 @@
     </w:p>
     <w:p>
       <w:pPr>
-        <w:pStyle w:val="Compact"/>
         <w:numPr>
           <w:ilvl w:val="0"/>
           <w:numId w:val="1003"/>
         </w:numPr>
+        <w:pStyle w:val="Compact"/>
       </w:pPr>
       <w:r>
         <w:t xml:space="preserve">Nombra los cuatro sellos de advertencia que existen en Chile.</w:t>
@@ -505,11 +744,11 @@
     </w:p>
     <w:p>
       <w:pPr>
-        <w:pStyle w:val="Compact"/>
         <w:numPr>
           <w:ilvl w:val="0"/>
           <w:numId w:val="1003"/>
         </w:numPr>
+        <w:pStyle w:val="Compact"/>
       </w:pPr>
       <w:r>
         <w:t xml:space="preserve">¿Qué ley chilena obliga a poner esos sellos?</w:t>
@@ -517,11 +756,11 @@
     </w:p>
     <w:p>
       <w:pPr>
-        <w:pStyle w:val="Compact"/>
         <w:numPr>
           <w:ilvl w:val="0"/>
           <w:numId w:val="1003"/>
         </w:numPr>
+        <w:pStyle w:val="Compact"/>
       </w:pPr>
       <w:r>
         <w:t xml:space="preserve">Corrige este almuerzo y explica dos de tus cambios:</w:t>
@@ -531,8 +770,8 @@
       </w:r>
       <w:r>
         <w:rPr>
+          <w:iCs/>
           <w:i/>
-          <w:iCs/>
         </w:rPr>
         <w:t xml:space="preserve">arroz, puré de papas, vienesas, bebida</w:t>
       </w:r>
@@ -542,11 +781,11 @@
     </w:p>
     <w:p>
       <w:pPr>
-        <w:pStyle w:val="Compact"/>
         <w:numPr>
           <w:ilvl w:val="0"/>
           <w:numId w:val="1003"/>
         </w:numPr>
+        <w:pStyle w:val="Compact"/>
       </w:pPr>
       <w:r>
         <w:t xml:space="preserve">Nombra las tres sustancias más dañinas del humo del cigarrillo.</w:t>
@@ -554,11 +793,11 @@
     </w:p>
     <w:p>
       <w:pPr>
-        <w:pStyle w:val="Compact"/>
         <w:numPr>
           <w:ilvl w:val="0"/>
           <w:numId w:val="1003"/>
         </w:numPr>
+        <w:pStyle w:val="Compact"/>
       </w:pPr>
       <w:r>
         <w:t xml:space="preserve">¿Qué efecto produce el alquitrán en los pulmones?</w:t>
@@ -566,11 +805,11 @@
     </w:p>
     <w:p>
       <w:pPr>
-        <w:pStyle w:val="Compact"/>
         <w:numPr>
           <w:ilvl w:val="0"/>
           <w:numId w:val="1003"/>
         </w:numPr>
+        <w:pStyle w:val="Compact"/>
       </w:pPr>
       <w:r>
         <w:t xml:space="preserve">¿Por qué el monóxido de carbono obliga al corazón a trabajar más?</w:t>
@@ -578,11 +817,11 @@
     </w:p>
     <w:p>
       <w:pPr>
-        <w:pStyle w:val="Compact"/>
         <w:numPr>
           <w:ilvl w:val="0"/>
           <w:numId w:val="1003"/>
         </w:numPr>
+        <w:pStyle w:val="Compact"/>
       </w:pPr>
       <w:r>
         <w:t xml:space="preserve">¿Qué es un fumador pasivo?</w:t>
@@ -590,11 +829,11 @@
     </w:p>
     <w:p>
       <w:pPr>
-        <w:pStyle w:val="Compact"/>
         <w:numPr>
           <w:ilvl w:val="0"/>
           <w:numId w:val="1003"/>
         </w:numPr>
+        <w:pStyle w:val="Compact"/>
       </w:pPr>
       <w:r>
         <w:t xml:space="preserve">Escribe dos estrategias para rechazar un cigarrillo.</w:t>
@@ -607,8 +846,9 @@
         </w:pict>
       </w:r>
     </w:p>
-    <w:bookmarkEnd w:id="12"/>
-    <w:bookmarkStart w:id="13" w:name="X78e1601eaae0d0617150431200acc94fb66215e"/>
+    <w:bookmarkEnd w:id="25"/>
+    <w:bookmarkEnd w:id="26"/>
+    <w:bookmarkStart w:id="28" w:name="X78e1601eaae0d0617150431200acc94fb66215e"/>
     <w:p>
       <w:pPr>
         <w:pStyle w:val="Heading2"/>
@@ -617,13 +857,94 @@
         <w:t xml:space="preserve">Parte IV · Historia, Geografía y Ciencias Sociales (10 puntos)</w:t>
       </w:r>
     </w:p>
-    <w:p>
-      <w:pPr>
-        <w:pStyle w:val="Compact"/>
+    <w:bookmarkStart w:id="27" w:name="palabras-nuevas-3"/>
+    <w:p>
+      <w:pPr>
+        <w:pStyle w:val="Heading4"/>
+      </w:pPr>
+      <w:r>
+        <w:t xml:space="preserve">📖 Palabras nuevas</w:t>
+      </w:r>
+    </w:p>
+    <w:p>
+      <w:pPr>
+        <w:pStyle w:val="FirstParagraph"/>
+      </w:pPr>
+      <w:r>
+        <w:rPr>
+          <w:bCs/>
+          <w:b/>
+        </w:rPr>
+        <w:t xml:space="preserve">Imperio.</w:t>
+      </w:r>
+      <w:r>
+        <w:t xml:space="preserve"> </w:t>
+      </w:r>
+      <w:r>
+        <w:t xml:space="preserve">Un territorio enorme con muchos pueblos gobernados desde un solo centro, como el imperio azteca o el inca.</w:t>
+      </w:r>
+    </w:p>
+    <w:p>
+      <w:pPr>
+        <w:pStyle w:val="BodyText"/>
+      </w:pPr>
+      <w:r>
+        <w:rPr>
+          <w:bCs/>
+          <w:b/>
+        </w:rPr>
+        <w:t xml:space="preserve">Encomienda.</w:t>
+      </w:r>
+      <w:r>
+        <w:t xml:space="preserve"> </w:t>
+      </w:r>
+      <w:r>
+        <w:t xml:space="preserve">Un sistema en que un grupo de indígenas quedaba «encomendado» a un español, que se quedaba con su trabajo a cambio de protegerlos. En la práctica era trabajo forzado.</w:t>
+      </w:r>
+    </w:p>
+    <w:p>
+      <w:pPr>
+        <w:pStyle w:val="BodyText"/>
+      </w:pPr>
+      <w:r>
+        <w:rPr>
+          <w:bCs/>
+          <w:b/>
+        </w:rPr>
+        <w:t xml:space="preserve">Frontera.</w:t>
+      </w:r>
+      <w:r>
+        <w:t xml:space="preserve"> </w:t>
+      </w:r>
+      <w:r>
+        <w:t xml:space="preserve">La línea que separa dos territorios. Después de Curalaba, el río Biobío quedó como frontera entre españoles y mapuche.</w:t>
+      </w:r>
+    </w:p>
+    <w:p>
+      <w:pPr>
+        <w:pStyle w:val="BodyText"/>
+      </w:pPr>
+      <w:r>
+        <w:rPr>
+          <w:bCs/>
+          <w:b/>
+        </w:rPr>
+        <w:t xml:space="preserve">Mestizaje.</w:t>
+      </w:r>
+      <w:r>
+        <w:t xml:space="preserve"> </w:t>
+      </w:r>
+      <w:r>
+        <w:t xml:space="preserve">La mezcla entre españoles e indígenas, tanto de familias como de costumbres, comidas y palabras. Por eso decimos «guagua», que viene del mapudungun.</w:t>
+      </w:r>
+    </w:p>
+    <w:p>
+      <w:pPr>
         <w:numPr>
           <w:ilvl w:val="0"/>
           <w:numId w:val="1004"/>
         </w:numPr>
+        <w:pStyle w:val="Compact"/>
       </w:pPr>
       <w:r>
         <w:t xml:space="preserve">¿Qué ocurrió el 12 de octubre de 1492?</w:t>
@@ -631,11 +952,11 @@
     </w:p>
     <w:p>
       <w:pPr>
-        <w:pStyle w:val="Compact"/>
         <w:numPr>
           <w:ilvl w:val="0"/>
           <w:numId w:val="1004"/>
         </w:numPr>
+        <w:pStyle w:val="Compact"/>
       </w:pPr>
       <w:r>
         <w:t xml:space="preserve">Nombra las tres naves del primer viaje de Colón.</w:t>
@@ -643,11 +964,11 @@
     </w:p>
     <w:p>
       <w:pPr>
-        <w:pStyle w:val="Compact"/>
         <w:numPr>
           <w:ilvl w:val="0"/>
           <w:numId w:val="1004"/>
         </w:numPr>
+        <w:pStyle w:val="Compact"/>
       </w:pPr>
       <w:r>
         <w:t xml:space="preserve">¿Qué ocurrió en 1453 y por qué impulsó los viajes de descubrimiento?</w:t>
@@ -655,11 +976,11 @@
     </w:p>
     <w:p>
       <w:pPr>
-        <w:pStyle w:val="Compact"/>
         <w:numPr>
           <w:ilvl w:val="0"/>
           <w:numId w:val="1004"/>
         </w:numPr>
+        <w:pStyle w:val="Compact"/>
       </w:pPr>
       <w:r>
         <w:t xml:space="preserve">¿Qué imperio conquistó Hernán Cortés? ¿Y Francisco Pizarro?</w:t>
@@ -667,11 +988,11 @@
     </w:p>
     <w:p>
       <w:pPr>
-        <w:pStyle w:val="Compact"/>
         <w:numPr>
           <w:ilvl w:val="0"/>
           <w:numId w:val="1004"/>
         </w:numPr>
+        <w:pStyle w:val="Compact"/>
       </w:pPr>
       <w:r>
         <w:t xml:space="preserve">Nombra tres razones del triunfo español sobre los grandes imperios americanos.</w:t>
@@ -679,11 +1000,11 @@
     </w:p>
     <w:p>
       <w:pPr>
-        <w:pStyle w:val="Compact"/>
         <w:numPr>
           <w:ilvl w:val="0"/>
           <w:numId w:val="1004"/>
         </w:numPr>
+        <w:pStyle w:val="Compact"/>
       </w:pPr>
       <w:r>
         <w:t xml:space="preserve">Define encomienda con tus palabras.</w:t>
@@ -691,11 +1012,11 @@
     </w:p>
     <w:p>
       <w:pPr>
-        <w:pStyle w:val="Compact"/>
         <w:numPr>
           <w:ilvl w:val="0"/>
           <w:numId w:val="1004"/>
         </w:numPr>
+        <w:pStyle w:val="Compact"/>
       </w:pPr>
       <w:r>
         <w:t xml:space="preserve">¿Quién fundó Santiago y en qué fecha exacta?</w:t>
@@ -703,11 +1024,11 @@
     </w:p>
     <w:p>
       <w:pPr>
-        <w:pStyle w:val="Compact"/>
         <w:numPr>
           <w:ilvl w:val="0"/>
           <w:numId w:val="1004"/>
         </w:numPr>
+        <w:pStyle w:val="Compact"/>
       </w:pPr>
       <w:r>
         <w:t xml:space="preserve">¿Qué ocurrió en la batalla de Tucapel en 1553 y quién lideró a los mapuche?</w:t>
@@ -715,11 +1036,11 @@
     </w:p>
     <w:p>
       <w:pPr>
-        <w:pStyle w:val="Compact"/>
         <w:numPr>
           <w:ilvl w:val="0"/>
           <w:numId w:val="1004"/>
         </w:numPr>
+        <w:pStyle w:val="Compact"/>
       </w:pPr>
       <w:r>
         <w:t xml:space="preserve">¿Qué fue el desastre de Curalaba y qué frontera estableció?</w:t>
@@ -727,11 +1048,11 @@
     </w:p>
     <w:p>
       <w:pPr>
-        <w:pStyle w:val="Compact"/>
         <w:numPr>
           <w:ilvl w:val="0"/>
           <w:numId w:val="1004"/>
         </w:numPr>
+        <w:pStyle w:val="Compact"/>
       </w:pPr>
       <w:r>
         <w:t xml:space="preserve">Explica qué es el mestizaje y da un ejemplo cultural chileno.</w:t>
@@ -744,8 +1065,9 @@
         </w:pict>
       </w:r>
     </w:p>
-    <w:bookmarkEnd w:id="13"/>
-    <w:bookmarkStart w:id="14" w:name="parte-v-english-10-points"/>
+    <w:bookmarkEnd w:id="27"/>
+    <w:bookmarkEnd w:id="28"/>
+    <w:bookmarkStart w:id="29" w:name="parte-v-english-10-points"/>
     <w:p>
       <w:pPr>
         <w:pStyle w:val="Heading2"/>
@@ -756,11 +1078,11 @@
     </w:p>
     <w:p>
       <w:pPr>
-        <w:pStyle w:val="Compact"/>
         <w:numPr>
           <w:ilvl w:val="0"/>
           <w:numId w:val="1005"/>
         </w:numPr>
+        <w:pStyle w:val="Compact"/>
       </w:pPr>
       <w:r>
         <w:t xml:space="preserve">Write in English: sandía, zapallo, avena, huevo, lentejas.</w:t>
@@ -768,11 +1090,11 @@
     </w:p>
     <w:p>
       <w:pPr>
-        <w:pStyle w:val="Compact"/>
         <w:numPr>
           <w:ilvl w:val="0"/>
           <w:numId w:val="1005"/>
         </w:numPr>
+        <w:pStyle w:val="Compact"/>
       </w:pPr>
       <w:r>
         <w:t xml:space="preserve">Write the plural: tomato, strawberry, potato, fish.</w:t>
@@ -780,11 +1102,11 @@
     </w:p>
     <w:p>
       <w:pPr>
-        <w:pStyle w:val="Compact"/>
         <w:numPr>
           <w:ilvl w:val="0"/>
           <w:numId w:val="1005"/>
         </w:numPr>
+        <w:pStyle w:val="Compact"/>
       </w:pPr>
       <w:r>
         <w:t xml:space="preserve">Complete with</w:t>
@@ -794,8 +1116,8 @@
       </w:r>
       <w:r>
         <w:rPr>
+          <w:iCs/>
           <w:i/>
-          <w:iCs/>
         </w:rPr>
         <w:t xml:space="preserve">like</w:t>
       </w:r>
@@ -810,8 +1132,8 @@
       </w:r>
       <w:r>
         <w:rPr>
+          <w:iCs/>
           <w:i/>
-          <w:iCs/>
         </w:rPr>
         <w:t xml:space="preserve">likes</w:t>
       </w:r>
@@ -821,11 +1143,11 @@
     </w:p>
     <w:p>
       <w:pPr>
-        <w:pStyle w:val="Compact"/>
         <w:numPr>
           <w:ilvl w:val="0"/>
           <w:numId w:val="1005"/>
         </w:numPr>
+        <w:pStyle w:val="Compact"/>
       </w:pPr>
       <w:r>
         <w:t xml:space="preserve">Complete with</w:t>
@@ -835,8 +1157,8 @@
       </w:r>
       <w:r>
         <w:rPr>
+          <w:iCs/>
           <w:i/>
-          <w:iCs/>
         </w:rPr>
         <w:t xml:space="preserve">is</w:t>
       </w:r>
@@ -851,8 +1173,8 @@
       </w:r>
       <w:r>
         <w:rPr>
+          <w:iCs/>
           <w:i/>
-          <w:iCs/>
         </w:rPr>
         <w:t xml:space="preserve">are</w:t>
       </w:r>
@@ -862,11 +1184,11 @@
     </w:p>
     <w:p>
       <w:pPr>
-        <w:pStyle w:val="Compact"/>
         <w:numPr>
           <w:ilvl w:val="0"/>
           <w:numId w:val="1005"/>
         </w:numPr>
+        <w:pStyle w:val="Compact"/>
       </w:pPr>
       <w:r>
         <w:t xml:space="preserve">Complete with</w:t>
@@ -876,8 +1198,8 @@
       </w:r>
       <w:r>
         <w:rPr>
+          <w:iCs/>
           <w:i/>
-          <w:iCs/>
         </w:rPr>
         <w:t xml:space="preserve">some</w:t>
       </w:r>
@@ -892,8 +1214,8 @@
       </w:r>
       <w:r>
         <w:rPr>
+          <w:iCs/>
           <w:i/>
-          <w:iCs/>
         </w:rPr>
         <w:t xml:space="preserve">any</w:t>
       </w:r>
@@ -903,11 +1225,11 @@
     </w:p>
     <w:p>
       <w:pPr>
-        <w:pStyle w:val="Compact"/>
         <w:numPr>
           <w:ilvl w:val="0"/>
           <w:numId w:val="1005"/>
         </w:numPr>
+        <w:pStyle w:val="Compact"/>
       </w:pPr>
       <w:r>
         <w:t xml:space="preserve">Complete with</w:t>
@@ -917,8 +1239,8 @@
       </w:r>
       <w:r>
         <w:rPr>
+          <w:iCs/>
           <w:i/>
-          <w:iCs/>
         </w:rPr>
         <w:t xml:space="preserve">How much</w:t>
       </w:r>
@@ -933,8 +1255,8 @@
       </w:r>
       <w:r>
         <w:rPr>
+          <w:iCs/>
           <w:i/>
-          <w:iCs/>
         </w:rPr>
         <w:t xml:space="preserve">How many</w:t>
       </w:r>
@@ -944,11 +1266,11 @@
     </w:p>
     <w:p>
       <w:pPr>
-        <w:pStyle w:val="Compact"/>
         <w:numPr>
           <w:ilvl w:val="0"/>
           <w:numId w:val="1005"/>
         </w:numPr>
+        <w:pStyle w:val="Compact"/>
       </w:pPr>
       <w:r>
         <w:t xml:space="preserve">Put the adverb in the right place:</w:t>
@@ -958,8 +1280,8 @@
       </w:r>
       <w:r>
         <w:rPr>
+          <w:iCs/>
           <w:i/>
-          <w:iCs/>
         </w:rPr>
         <w:t xml:space="preserve">I eat vegetables.</w:t>
       </w:r>
@@ -972,11 +1294,11 @@
     </w:p>
     <w:p>
       <w:pPr>
-        <w:pStyle w:val="Compact"/>
         <w:numPr>
           <w:ilvl w:val="0"/>
           <w:numId w:val="1005"/>
         </w:numPr>
+        <w:pStyle w:val="Compact"/>
       </w:pPr>
       <w:r>
         <w:t xml:space="preserve">Complete with</w:t>
@@ -986,8 +1308,8 @@
       </w:r>
       <w:r>
         <w:rPr>
+          <w:iCs/>
           <w:i/>
-          <w:iCs/>
         </w:rPr>
         <w:t xml:space="preserve">should</w:t>
       </w:r>
@@ -1002,8 +1324,8 @@
       </w:r>
       <w:r>
         <w:rPr>
+          <w:iCs/>
           <w:i/>
-          <w:iCs/>
         </w:rPr>
         <w:t xml:space="preserve">shouldn’t</w:t>
       </w:r>
@@ -1013,11 +1335,11 @@
     </w:p>
     <w:p>
       <w:pPr>
-        <w:pStyle w:val="Compact"/>
         <w:numPr>
           <w:ilvl w:val="0"/>
           <w:numId w:val="1005"/>
         </w:numPr>
+        <w:pStyle w:val="Compact"/>
       </w:pPr>
       <w:r>
         <w:t xml:space="preserve">Translate:</w:t>
@@ -1027,19 +1349,19 @@
       </w:r>
       <w:r>
         <w:rPr>
+          <w:iCs/>
           <w:i/>
-          <w:iCs/>
         </w:rPr>
         <w:t xml:space="preserve">No me gustan las cebollas, pero me encanta el choclo.</w:t>
       </w:r>
     </w:p>
     <w:p>
       <w:pPr>
-        <w:pStyle w:val="Compact"/>
         <w:numPr>
           <w:ilvl w:val="0"/>
           <w:numId w:val="1005"/>
         </w:numPr>
+        <w:pStyle w:val="Compact"/>
       </w:pPr>
       <w:r>
         <w:t xml:space="preserve">Write three sentences in English describing a healthy lunch.</w:t>
@@ -1052,8 +1374,8 @@
         </w:pict>
       </w:r>
     </w:p>
-    <w:bookmarkEnd w:id="14"/>
-    <w:bookmarkStart w:id="15" w:name="parte-vi-sección-integradora-5-puntos"/>
+    <w:bookmarkEnd w:id="29"/>
+    <w:bookmarkStart w:id="31" w:name="parte-vi-sección-integradora-5-puntos"/>
     <w:p>
       <w:pPr>
         <w:pStyle w:val="Heading2"/>
@@ -1062,13 +1384,58 @@
         <w:t xml:space="preserve">Parte VI · Sección integradora (5 puntos)</w:t>
       </w:r>
     </w:p>
-    <w:p>
-      <w:pPr>
-        <w:pStyle w:val="Compact"/>
+    <w:bookmarkStart w:id="30" w:name="palabras-nuevas-4"/>
+    <w:p>
+      <w:pPr>
+        <w:pStyle w:val="Heading4"/>
+      </w:pPr>
+      <w:r>
+        <w:t xml:space="preserve">📖 Palabras nuevas</w:t>
+      </w:r>
+    </w:p>
+    <w:p>
+      <w:pPr>
+        <w:pStyle w:val="FirstParagraph"/>
+      </w:pPr>
+      <w:r>
+        <w:rPr>
+          <w:bCs/>
+          <w:b/>
+        </w:rPr>
+        <w:t xml:space="preserve">Integradora.</w:t>
+      </w:r>
+      <w:r>
+        <w:t xml:space="preserve"> </w:t>
+      </w:r>
+      <w:r>
+        <w:t xml:space="preserve">Que mezcla varias asignaturas en una misma pregunta, por ejemplo matemáticas con ciencias.</w:t>
+      </w:r>
+    </w:p>
+    <w:p>
+      <w:pPr>
+        <w:pStyle w:val="BodyText"/>
+      </w:pPr>
+      <w:r>
+        <w:rPr>
+          <w:bCs/>
+          <w:b/>
+        </w:rPr>
+        <w:t xml:space="preserve">Zarpar.</w:t>
+      </w:r>
+      <w:r>
+        <w:t xml:space="preserve"> </w:t>
+      </w:r>
+      <w:r>
+        <w:t xml:space="preserve">Cuando un barco sale del puerto y empieza su viaje. Colón zarpó de Palos el 3 de agosto de 1492.</w:t>
+      </w:r>
+    </w:p>
+    <w:p>
+      <w:pPr>
         <w:numPr>
           <w:ilvl w:val="0"/>
           <w:numId w:val="1006"/>
         </w:numPr>
+        <w:pStyle w:val="Compact"/>
       </w:pPr>
       <w:r>
         <w:t xml:space="preserve">Un almuerzo pesa 400 gramos en total y respeta el modelo del plato saludable. ¿Cuántos gramos corresponden a verduras y frutas? ¿Cuántos a proteínas?</w:t>
@@ -1076,11 +1443,11 @@
     </w:p>
     <w:p>
       <w:pPr>
-        <w:pStyle w:val="Compact"/>
         <w:numPr>
           <w:ilvl w:val="0"/>
           <w:numId w:val="1006"/>
         </w:numPr>
+        <w:pStyle w:val="Compact"/>
       </w:pPr>
       <w:r>
         <w:t xml:space="preserve">Escribe en inglés tres alimentos que aparecen en el modelo del plato saludable.</w:t>
@@ -1088,11 +1455,11 @@
     </w:p>
     <w:p>
       <w:pPr>
-        <w:pStyle w:val="Compact"/>
         <w:numPr>
           <w:ilvl w:val="0"/>
           <w:numId w:val="1006"/>
         </w:numPr>
+        <w:pStyle w:val="Compact"/>
       </w:pPr>
       <w:r>
         <w:t xml:space="preserve">Nombra dos alimentos que llegaron de América a Europa y escribe uno de ellos en inglés.</w:t>
@@ -1100,11 +1467,11 @@
     </w:p>
     <w:p>
       <w:pPr>
-        <w:pStyle w:val="Compact"/>
         <w:numPr>
           <w:ilvl w:val="0"/>
           <w:numId w:val="1006"/>
         </w:numPr>
+        <w:pStyle w:val="Compact"/>
       </w:pPr>
       <w:r>
         <w:t xml:space="preserve">Escribe una metáfora original sobre el océano que cruzó Colón.</w:t>
@@ -1112,11 +1479,11 @@
     </w:p>
     <w:p>
       <w:pPr>
-        <w:pStyle w:val="Compact"/>
         <w:numPr>
           <w:ilvl w:val="0"/>
           <w:numId w:val="1006"/>
         </w:numPr>
+        <w:pStyle w:val="Compact"/>
       </w:pPr>
       <w:r>
         <w:t xml:space="preserve">Colón zarpó de Palos el 3 de agosto de 1492 y llegó a tierra el 12 de octubre de 1492. ¿Cuántos días navegó?</w:t>
@@ -1127,9 +1494,10 @@
         <w:br w:type="page"/>
       </w:r>
     </w:p>
-    <w:bookmarkEnd w:id="15"/>
-    <w:bookmarkEnd w:id="16"/>
-    <w:bookmarkStart w:id="25" w:name="solucionario-evaluación-final-integrada"/>
+    <w:bookmarkEnd w:id="30"/>
+    <w:bookmarkEnd w:id="31"/>
+    <w:bookmarkEnd w:id="32"/>
+    <w:bookmarkStart w:id="41" w:name="solucionario-evaluación-final-integrada"/>
     <w:p>
       <w:pPr>
         <w:pStyle w:val="Heading1"/>
@@ -1144,8 +1512,8 @@
       </w:pPr>
       <w:r>
         <w:rPr>
+          <w:bCs/>
           <w:b/>
-          <w:bCs/>
         </w:rPr>
         <w:t xml:space="preserve">Uso del adulto.</w:t>
       </w:r>
@@ -1156,7 +1524,7 @@
         <w:t xml:space="preserve">Esta sección no debe entregarse junto con la evaluación.</w:t>
       </w:r>
     </w:p>
-    <w:bookmarkStart w:id="17" w:name="parte-i-matemáticas"/>
+    <w:bookmarkStart w:id="33" w:name="parte-i-matemáticas"/>
     <w:p>
       <w:pPr>
         <w:pStyle w:val="Heading2"/>
@@ -1167,11 +1535,11 @@
     </w:p>
     <w:p>
       <w:pPr>
-        <w:pStyle w:val="Compact"/>
         <w:numPr>
           <w:ilvl w:val="0"/>
           <w:numId w:val="1007"/>
         </w:numPr>
+        <w:pStyle w:val="Compact"/>
       </w:pPr>
       <w:r>
         <w:t xml:space="preserve">Quinientos veinticinco mil cuatrocientos ocho.</w:t>
@@ -1179,11 +1547,11 @@
     </w:p>
     <w:p>
       <w:pPr>
-        <w:pStyle w:val="Compact"/>
         <w:numPr>
           <w:ilvl w:val="0"/>
           <w:numId w:val="1007"/>
         </w:numPr>
+        <w:pStyle w:val="Compact"/>
       </w:pPr>
       <w:r>
         <w:t xml:space="preserve">40.000 (cuatro decenas de mil).</w:t>
@@ -1191,11 +1559,11 @@
     </w:p>
     <w:p>
       <w:pPr>
-        <w:pStyle w:val="Compact"/>
         <w:numPr>
           <w:ilvl w:val="0"/>
           <w:numId w:val="1007"/>
         </w:numPr>
+        <w:pStyle w:val="Compact"/>
       </w:pPr>
       <w:r>
         <w:t xml:space="preserve">81.315</w:t>
@@ -1203,11 +1571,11 @@
     </w:p>
     <w:p>
       <w:pPr>
-        <w:pStyle w:val="Compact"/>
         <w:numPr>
           <w:ilvl w:val="0"/>
           <w:numId w:val="1007"/>
         </w:numPr>
+        <w:pStyle w:val="Compact"/>
       </w:pPr>
       <w:r>
         <w:t xml:space="preserve">819</w:t>
@@ -1215,11 +1583,11 @@
     </w:p>
     <w:p>
       <w:pPr>
-        <w:pStyle w:val="Compact"/>
         <w:numPr>
           <w:ilvl w:val="0"/>
           <w:numId w:val="1007"/>
         </w:numPr>
+        <w:pStyle w:val="Compact"/>
       </w:pPr>
       <w:r>
         <w:t xml:space="preserve">3 5/8</w:t>
@@ -1227,11 +1595,11 @@
     </w:p>
     <w:p>
       <w:pPr>
-        <w:pStyle w:val="Compact"/>
         <w:numPr>
           <w:ilvl w:val="0"/>
           <w:numId w:val="1007"/>
         </w:numPr>
+        <w:pStyle w:val="Compact"/>
       </w:pPr>
       <w:r>
         <w:t xml:space="preserve">6/10 + 3/10 = 9/10</w:t>
@@ -1239,11 +1607,11 @@
     </w:p>
     <w:p>
       <w:pPr>
-        <w:pStyle w:val="Compact"/>
         <w:numPr>
           <w:ilvl w:val="0"/>
           <w:numId w:val="1007"/>
         </w:numPr>
+        <w:pStyle w:val="Compact"/>
       </w:pPr>
       <w:r>
         <w:t xml:space="preserve">5/6 − 3/6 = 2/6 = 1/3</w:t>
@@ -1251,11 +1619,11 @@
     </w:p>
     <w:p>
       <w:pPr>
-        <w:pStyle w:val="Compact"/>
         <w:numPr>
           <w:ilvl w:val="0"/>
           <w:numId w:val="1007"/>
         </w:numPr>
+        <w:pStyle w:val="Compact"/>
       </w:pPr>
       <w:r>
         <w:t xml:space="preserve">2,007 · 2,07 · 2,077 · 2,7</w:t>
@@ -1263,11 +1631,11 @@
     </w:p>
     <w:p>
       <w:pPr>
-        <w:pStyle w:val="Compact"/>
         <w:numPr>
           <w:ilvl w:val="0"/>
           <w:numId w:val="1007"/>
         </w:numPr>
+        <w:pStyle w:val="Compact"/>
       </w:pPr>
       <w:r>
         <w:t xml:space="preserve">17,55</w:t>
@@ -1275,18 +1643,18 @@
     </w:p>
     <w:p>
       <w:pPr>
-        <w:pStyle w:val="Compact"/>
         <w:numPr>
           <w:ilvl w:val="0"/>
           <w:numId w:val="1007"/>
         </w:numPr>
+        <w:pStyle w:val="Compact"/>
       </w:pPr>
       <w:r>
         <w:t xml:space="preserve">148 × 36 = 5.328 km</w:t>
       </w:r>
     </w:p>
-    <w:bookmarkEnd w:id="17"/>
-    <w:bookmarkStart w:id="18" w:name="parte-ii-lenguaje"/>
+    <w:bookmarkEnd w:id="33"/>
+    <w:bookmarkStart w:id="34" w:name="parte-ii-lenguaje"/>
     <w:p>
       <w:pPr>
         <w:pStyle w:val="Heading2"/>
@@ -1297,11 +1665,11 @@
     </w:p>
     <w:p>
       <w:pPr>
-        <w:pStyle w:val="Compact"/>
         <w:numPr>
           <w:ilvl w:val="0"/>
           <w:numId w:val="1008"/>
         </w:numPr>
+        <w:pStyle w:val="Compact"/>
       </w:pPr>
       <w:r>
         <w:t xml:space="preserve">2 estrofas y 8 versos.</w:t>
@@ -1309,11 +1677,11 @@
     </w:p>
     <w:p>
       <w:pPr>
-        <w:pStyle w:val="Compact"/>
         <w:numPr>
           <w:ilvl w:val="0"/>
           <w:numId w:val="1008"/>
         </w:numPr>
+        <w:pStyle w:val="Compact"/>
       </w:pPr>
       <w:r>
         <w:t xml:space="preserve">Primera estrofa: país / gris. Segunda estrofa: colores / flores. En ambos casos, rima consonante.</w:t>
@@ -1321,11 +1689,11 @@
     </w:p>
     <w:p>
       <w:pPr>
-        <w:pStyle w:val="Compact"/>
         <w:numPr>
           <w:ilvl w:val="0"/>
           <w:numId w:val="1008"/>
         </w:numPr>
+        <w:pStyle w:val="Compact"/>
       </w:pPr>
       <w:r>
         <w:t xml:space="preserve">Alguien que encuentra un mapa antiguo en el cajón de su abuela y juega a dibujarlo; probablemente una niña o un niño.</w:t>
@@ -1333,11 +1701,11 @@
     </w:p>
     <w:p>
       <w:pPr>
-        <w:pStyle w:val="Compact"/>
         <w:numPr>
           <w:ilvl w:val="0"/>
           <w:numId w:val="1008"/>
         </w:numPr>
+        <w:pStyle w:val="Compact"/>
       </w:pPr>
       <w:r>
         <w:t xml:space="preserve">El mapa viejo.</w:t>
@@ -1345,11 +1713,11 @@
     </w:p>
     <w:p>
       <w:pPr>
-        <w:pStyle w:val="Compact"/>
         <w:numPr>
           <w:ilvl w:val="0"/>
           <w:numId w:val="1008"/>
         </w:numPr>
+        <w:pStyle w:val="Compact"/>
       </w:pPr>
       <w:r>
         <w:t xml:space="preserve">Que la imaginación puede darle vida nueva a algo viejo y olvidado. Se acepta cualquier formulación equivalente.</w:t>
@@ -1357,11 +1725,11 @@
     </w:p>
     <w:p>
       <w:pPr>
-        <w:pStyle w:val="Compact"/>
         <w:numPr>
           <w:ilvl w:val="0"/>
           <w:numId w:val="1008"/>
         </w:numPr>
+        <w:pStyle w:val="Compact"/>
       </w:pPr>
       <w:r>
         <w:t xml:space="preserve">Metáfora.</w:t>
@@ -1369,11 +1737,11 @@
     </w:p>
     <w:p>
       <w:pPr>
-        <w:pStyle w:val="Compact"/>
         <w:numPr>
           <w:ilvl w:val="0"/>
           <w:numId w:val="1008"/>
         </w:numPr>
+        <w:pStyle w:val="Compact"/>
       </w:pPr>
       <w:r>
         <w:t xml:space="preserve">Personificación.</w:t>
@@ -1381,11 +1749,11 @@
     </w:p>
     <w:p>
       <w:pPr>
-        <w:pStyle w:val="Compact"/>
         <w:numPr>
           <w:ilvl w:val="0"/>
           <w:numId w:val="1008"/>
         </w:numPr>
+        <w:pStyle w:val="Compact"/>
       </w:pPr>
       <w:r>
         <w:t xml:space="preserve">Al género lírico: está escrito en verso y estrofas, tiene rima, y expresa sentimientos a través de un hablante lírico.</w:t>
@@ -1393,19 +1761,19 @@
     </w:p>
     <w:p>
       <w:pPr>
-        <w:pStyle w:val="Compact"/>
         <w:numPr>
           <w:ilvl w:val="0"/>
           <w:numId w:val="1008"/>
         </w:numPr>
+        <w:pStyle w:val="Compact"/>
       </w:pPr>
       <w:r>
         <w:t xml:space="preserve">La comparación usa un nexo (</w:t>
       </w:r>
       <w:r>
         <w:rPr>
+          <w:iCs/>
           <w:i/>
-          <w:iCs/>
         </w:rPr>
         <w:t xml:space="preserve">el mapa es como una piel arrugada</w:t>
       </w:r>
@@ -1414,8 +1782,8 @@
       </w:r>
       <w:r>
         <w:rPr>
+          <w:iCs/>
           <w:i/>
-          <w:iCs/>
         </w:rPr>
         <w:t xml:space="preserve">el mapa es una piel arrugada</w:t>
       </w:r>
@@ -1425,18 +1793,18 @@
     </w:p>
     <w:p>
       <w:pPr>
-        <w:pStyle w:val="Compact"/>
         <w:numPr>
           <w:ilvl w:val="0"/>
           <w:numId w:val="1008"/>
         </w:numPr>
+        <w:pStyle w:val="Compact"/>
       </w:pPr>
       <w:r>
         <w:t xml:space="preserve">Respuesta abierta. Debe incluir un nexo comparativo (como, parece, igual que).</w:t>
       </w:r>
     </w:p>
-    <w:bookmarkEnd w:id="18"/>
-    <w:bookmarkStart w:id="19" w:name="parte-iii-ciencias-naturales"/>
+    <w:bookmarkEnd w:id="34"/>
+    <w:bookmarkStart w:id="35" w:name="parte-iii-ciencias-naturales"/>
     <w:p>
       <w:pPr>
         <w:pStyle w:val="Heading2"/>
@@ -1447,11 +1815,11 @@
     </w:p>
     <w:p>
       <w:pPr>
-        <w:pStyle w:val="Compact"/>
         <w:numPr>
           <w:ilvl w:val="0"/>
           <w:numId w:val="1009"/>
         </w:numPr>
+        <w:pStyle w:val="Compact"/>
       </w:pPr>
       <w:r>
         <w:t xml:space="preserve">Alimentación equilibrada, actividad física, higiene, sueño e hidratación.</w:t>
@@ -1459,11 +1827,11 @@
     </w:p>
     <w:p>
       <w:pPr>
-        <w:pStyle w:val="Compact"/>
         <w:numPr>
           <w:ilvl w:val="0"/>
           <w:numId w:val="1009"/>
         </w:numPr>
+        <w:pStyle w:val="Compact"/>
       </w:pPr>
       <w:r>
         <w:t xml:space="preserve">Verduras y frutas: la mitad (1/2). Proteínas: un cuarto (1/4).</w:t>
@@ -1471,11 +1839,11 @@
     </w:p>
     <w:p>
       <w:pPr>
-        <w:pStyle w:val="Compact"/>
         <w:numPr>
           <w:ilvl w:val="0"/>
           <w:numId w:val="1009"/>
         </w:numPr>
+        <w:pStyle w:val="Compact"/>
       </w:pPr>
       <w:r>
         <w:t xml:space="preserve">ALTO EN AZÚCARES, ALTO EN SODIO, ALTO EN GRASAS SATURADAS y ALTO EN CALORÍAS.</w:t>
@@ -1483,11 +1851,11 @@
     </w:p>
     <w:p>
       <w:pPr>
-        <w:pStyle w:val="Compact"/>
         <w:numPr>
           <w:ilvl w:val="0"/>
           <w:numId w:val="1009"/>
         </w:numPr>
+        <w:pStyle w:val="Compact"/>
       </w:pPr>
       <w:r>
         <w:t xml:space="preserve">La Ley 20.606, de etiquetado de alimentos.</w:t>
@@ -1495,11 +1863,11 @@
     </w:p>
     <w:p>
       <w:pPr>
-        <w:pStyle w:val="Compact"/>
         <w:numPr>
           <w:ilvl w:val="0"/>
           <w:numId w:val="1009"/>
         </w:numPr>
+        <w:pStyle w:val="Compact"/>
       </w:pPr>
       <w:r>
         <w:t xml:space="preserve">El arroz y el puré son del mismo grupo y ocupan dos veces el cuarto del plato; faltan verduras; las vienesas son un embutido con sellos; la bebida aporta azúcar. Versión corregida, por ejemplo: ensalada de lechuga y tomate (mitad), arroz (un cuarto), pollo o pescado (un cuarto) y agua.</w:t>
@@ -1507,11 +1875,11 @@
     </w:p>
     <w:p>
       <w:pPr>
-        <w:pStyle w:val="Compact"/>
         <w:numPr>
           <w:ilvl w:val="0"/>
           <w:numId w:val="1009"/>
         </w:numPr>
+        <w:pStyle w:val="Compact"/>
       </w:pPr>
       <w:r>
         <w:t xml:space="preserve">Nicotina, alquitrán y monóxido de carbono.</w:t>
@@ -1519,11 +1887,11 @@
     </w:p>
     <w:p>
       <w:pPr>
-        <w:pStyle w:val="Compact"/>
         <w:numPr>
           <w:ilvl w:val="0"/>
           <w:numId w:val="1009"/>
         </w:numPr>
+        <w:pStyle w:val="Compact"/>
       </w:pPr>
       <w:r>
         <w:t xml:space="preserve">Se deposita en los pulmones, destruye los cilios que limpian las vías respiratorias y es la principal causa del cáncer pulmonar.</w:t>
@@ -1531,11 +1899,11 @@
     </w:p>
     <w:p>
       <w:pPr>
-        <w:pStyle w:val="Compact"/>
         <w:numPr>
           <w:ilvl w:val="0"/>
           <w:numId w:val="1009"/>
         </w:numPr>
+        <w:pStyle w:val="Compact"/>
       </w:pPr>
       <w:r>
         <w:t xml:space="preserve">Porque ocupa en la sangre el lugar del oxígeno, de modo que el corazón debe bombear más veces para entregar el oxígeno que el cuerpo necesita.</w:t>
@@ -1543,11 +1911,11 @@
     </w:p>
     <w:p>
       <w:pPr>
-        <w:pStyle w:val="Compact"/>
         <w:numPr>
           <w:ilvl w:val="0"/>
           <w:numId w:val="1009"/>
         </w:numPr>
+        <w:pStyle w:val="Compact"/>
       </w:pPr>
       <w:r>
         <w:t xml:space="preserve">Quien respira el humo del cigarrillo de otras personas sin fumar.</w:t>
@@ -1555,18 +1923,18 @@
     </w:p>
     <w:p>
       <w:pPr>
-        <w:pStyle w:val="Compact"/>
         <w:numPr>
           <w:ilvl w:val="0"/>
           <w:numId w:val="1009"/>
         </w:numPr>
+        <w:pStyle w:val="Compact"/>
       </w:pPr>
       <w:r>
         <w:t xml:space="preserve">Por ejemplo: decir que no directamente, dar una razón propia, cambiar de tema o de lugar, buscar amigos que no fumen, avisar a un adulto de confianza.</w:t>
       </w:r>
     </w:p>
-    <w:bookmarkEnd w:id="19"/>
-    <w:bookmarkStart w:id="20" w:name="parte-iv-historia"/>
+    <w:bookmarkEnd w:id="35"/>
+    <w:bookmarkStart w:id="36" w:name="parte-iv-historia"/>
     <w:p>
       <w:pPr>
         <w:pStyle w:val="Heading2"/>
@@ -1577,11 +1945,11 @@
     </w:p>
     <w:p>
       <w:pPr>
-        <w:pStyle w:val="Compact"/>
         <w:numPr>
           <w:ilvl w:val="0"/>
           <w:numId w:val="1010"/>
         </w:numPr>
+        <w:pStyle w:val="Compact"/>
       </w:pPr>
       <w:r>
         <w:t xml:space="preserve">Cristóbal Colón llegó a la isla de Guanahaní, en el Caribe, iniciando el contacto entre Europa y América.</w:t>
@@ -1589,11 +1957,11 @@
     </w:p>
     <w:p>
       <w:pPr>
-        <w:pStyle w:val="Compact"/>
         <w:numPr>
           <w:ilvl w:val="0"/>
           <w:numId w:val="1010"/>
         </w:numPr>
+        <w:pStyle w:val="Compact"/>
       </w:pPr>
       <w:r>
         <w:t xml:space="preserve">La Santa María, la Pinta y la Niña.</w:t>
@@ -1601,11 +1969,11 @@
     </w:p>
     <w:p>
       <w:pPr>
-        <w:pStyle w:val="Compact"/>
         <w:numPr>
           <w:ilvl w:val="0"/>
           <w:numId w:val="1010"/>
         </w:numPr>
+        <w:pStyle w:val="Compact"/>
       </w:pPr>
       <w:r>
         <w:t xml:space="preserve">Cayó Constantinopla en manos de los turcos otomanos, lo que cerró la ruta terrestre hacia Asia y obligó a buscar una ruta marítima.</w:t>
@@ -1613,11 +1981,11 @@
     </w:p>
     <w:p>
       <w:pPr>
-        <w:pStyle w:val="Compact"/>
         <w:numPr>
           <w:ilvl w:val="0"/>
           <w:numId w:val="1010"/>
         </w:numPr>
+        <w:pStyle w:val="Compact"/>
       </w:pPr>
       <w:r>
         <w:t xml:space="preserve">Cortés conquistó el imperio azteca; Pizarro, el imperio inca.</w:t>
@@ -1625,11 +1993,11 @@
     </w:p>
     <w:p>
       <w:pPr>
-        <w:pStyle w:val="Compact"/>
         <w:numPr>
           <w:ilvl w:val="0"/>
           <w:numId w:val="1010"/>
         </w:numPr>
+        <w:pStyle w:val="Compact"/>
       </w:pPr>
       <w:r>
         <w:t xml:space="preserve">Armas de fuego y de acero, caballos, alianzas con pueblos sometidos, enfermedades europeas como la viruela, y los conflictos internos de los incas. Bastan tres.</w:t>
@@ -1637,11 +2005,11 @@
     </w:p>
     <w:p>
       <w:pPr>
-        <w:pStyle w:val="Compact"/>
         <w:numPr>
           <w:ilvl w:val="0"/>
           <w:numId w:val="1010"/>
         </w:numPr>
+        <w:pStyle w:val="Compact"/>
       </w:pPr>
       <w:r>
         <w:t xml:space="preserve">Un grupo de indígenas quedaba entregado a un español, que recibía su trabajo y su tributo a cambio de protegerlos y evangelizarlos. En la práctica fue trabajo forzado.</w:t>
@@ -1649,11 +2017,11 @@
     </w:p>
     <w:p>
       <w:pPr>
-        <w:pStyle w:val="Compact"/>
         <w:numPr>
           <w:ilvl w:val="0"/>
           <w:numId w:val="1010"/>
         </w:numPr>
+        <w:pStyle w:val="Compact"/>
       </w:pPr>
       <w:r>
         <w:t xml:space="preserve">Pedro de Valdivia, el 12 de febrero de 1541.</w:t>
@@ -1661,11 +2029,11 @@
     </w:p>
     <w:p>
       <w:pPr>
-        <w:pStyle w:val="Compact"/>
         <w:numPr>
           <w:ilvl w:val="0"/>
           <w:numId w:val="1010"/>
         </w:numPr>
+        <w:pStyle w:val="Compact"/>
       </w:pPr>
       <w:r>
         <w:t xml:space="preserve">Los mapuche derrotaron a los españoles y murió Pedro de Valdivia. Los lideró Lautaro.</w:t>
@@ -1673,11 +2041,11 @@
     </w:p>
     <w:p>
       <w:pPr>
-        <w:pStyle w:val="Compact"/>
         <w:numPr>
           <w:ilvl w:val="0"/>
           <w:numId w:val="1010"/>
         </w:numPr>
+        <w:pStyle w:val="Compact"/>
       </w:pPr>
       <w:r>
         <w:t xml:space="preserve">Una derrota española en 1598 en la que murió el gobernador Óñez de Loyola; los mapuche destruyeron las ciudades al sur del Biobío y ese río quedó como frontera.</w:t>
@@ -1685,18 +2053,18 @@
     </w:p>
     <w:p>
       <w:pPr>
-        <w:pStyle w:val="Compact"/>
         <w:numPr>
           <w:ilvl w:val="0"/>
           <w:numId w:val="1010"/>
         </w:numPr>
+        <w:pStyle w:val="Compact"/>
       </w:pPr>
       <w:r>
         <w:t xml:space="preserve">La mezcla biológica y cultural entre españoles e indígenas. Ejemplo cultural: palabras chilenas de origen mapudungun o quechua, como guagua, charqui o pilucho.</w:t>
       </w:r>
     </w:p>
-    <w:bookmarkEnd w:id="20"/>
-    <w:bookmarkStart w:id="21" w:name="parte-v-english"/>
+    <w:bookmarkEnd w:id="36"/>
+    <w:bookmarkStart w:id="37" w:name="parte-v-english"/>
     <w:p>
       <w:pPr>
         <w:pStyle w:val="Heading2"/>
@@ -1707,11 +2075,11 @@
     </w:p>
     <w:p>
       <w:pPr>
-        <w:pStyle w:val="Compact"/>
         <w:numPr>
           <w:ilvl w:val="0"/>
           <w:numId w:val="1011"/>
         </w:numPr>
+        <w:pStyle w:val="Compact"/>
       </w:pPr>
       <w:r>
         <w:t xml:space="preserve">watermelon, pumpkin, oats, egg, lentils.</w:t>
@@ -1719,11 +2087,11 @@
     </w:p>
     <w:p>
       <w:pPr>
-        <w:pStyle w:val="Compact"/>
         <w:numPr>
           <w:ilvl w:val="0"/>
           <w:numId w:val="1011"/>
         </w:numPr>
+        <w:pStyle w:val="Compact"/>
       </w:pPr>
       <w:r>
         <w:t xml:space="preserve">tomatoes, strawberries, potatoes, fish.</w:t>
@@ -1731,20 +2099,20 @@
     </w:p>
     <w:p>
       <w:pPr>
-        <w:pStyle w:val="Compact"/>
         <w:numPr>
           <w:ilvl w:val="0"/>
           <w:numId w:val="1011"/>
         </w:numPr>
-      </w:pPr>
-    </w:p>
-    <w:p>
-      <w:pPr>
-        <w:pStyle w:val="Compact"/>
+        <w:pStyle w:val="Compact"/>
+      </w:pPr>
+    </w:p>
+    <w:p>
+      <w:pPr>
         <w:numPr>
           <w:ilvl w:val="1"/>
           <w:numId w:val="1012"/>
         </w:numPr>
+        <w:pStyle w:val="Compact"/>
       </w:pPr>
       <w:r>
         <w:t xml:space="preserve">like · b) likes</w:t>
@@ -1752,20 +2120,20 @@
     </w:p>
     <w:p>
       <w:pPr>
-        <w:pStyle w:val="Compact"/>
         <w:numPr>
           <w:ilvl w:val="0"/>
           <w:numId w:val="1011"/>
         </w:numPr>
-      </w:pPr>
-    </w:p>
-    <w:p>
-      <w:pPr>
-        <w:pStyle w:val="Compact"/>
+        <w:pStyle w:val="Compact"/>
+      </w:pPr>
+    </w:p>
+    <w:p>
+      <w:pPr>
         <w:numPr>
           <w:ilvl w:val="1"/>
           <w:numId w:val="1013"/>
         </w:numPr>
+        <w:pStyle w:val="Compact"/>
       </w:pPr>
       <w:r>
         <w:t xml:space="preserve">is · b) are</w:t>
@@ -1773,20 +2141,20 @@
     </w:p>
     <w:p>
       <w:pPr>
-        <w:pStyle w:val="Compact"/>
         <w:numPr>
           <w:ilvl w:val="0"/>
           <w:numId w:val="1011"/>
         </w:numPr>
-      </w:pPr>
-    </w:p>
-    <w:p>
-      <w:pPr>
-        <w:pStyle w:val="Compact"/>
+        <w:pStyle w:val="Compact"/>
+      </w:pPr>
+    </w:p>
+    <w:p>
+      <w:pPr>
         <w:numPr>
           <w:ilvl w:val="1"/>
           <w:numId w:val="1014"/>
         </w:numPr>
+        <w:pStyle w:val="Compact"/>
       </w:pPr>
       <w:r>
         <w:t xml:space="preserve">any · b) any</w:t>
@@ -1794,20 +2162,20 @@
     </w:p>
     <w:p>
       <w:pPr>
-        <w:pStyle w:val="Compact"/>
         <w:numPr>
           <w:ilvl w:val="0"/>
           <w:numId w:val="1011"/>
         </w:numPr>
-      </w:pPr>
-    </w:p>
-    <w:p>
-      <w:pPr>
-        <w:pStyle w:val="Compact"/>
+        <w:pStyle w:val="Compact"/>
+      </w:pPr>
+    </w:p>
+    <w:p>
+      <w:pPr>
         <w:numPr>
           <w:ilvl w:val="1"/>
           <w:numId w:val="1015"/>
         </w:numPr>
+        <w:pStyle w:val="Compact"/>
       </w:pPr>
       <w:r>
         <w:t xml:space="preserve">How many · b) How much</w:t>
@@ -1815,11 +2183,11 @@
     </w:p>
     <w:p>
       <w:pPr>
-        <w:pStyle w:val="Compact"/>
         <w:numPr>
           <w:ilvl w:val="0"/>
           <w:numId w:val="1011"/>
         </w:numPr>
+        <w:pStyle w:val="Compact"/>
       </w:pPr>
       <w:r>
         <w:t xml:space="preserve">I always eat vegetables.</w:t>
@@ -1827,20 +2195,20 @@
     </w:p>
     <w:p>
       <w:pPr>
-        <w:pStyle w:val="Compact"/>
         <w:numPr>
           <w:ilvl w:val="0"/>
           <w:numId w:val="1011"/>
         </w:numPr>
-      </w:pPr>
-    </w:p>
-    <w:p>
-      <w:pPr>
-        <w:pStyle w:val="Compact"/>
+        <w:pStyle w:val="Compact"/>
+      </w:pPr>
+    </w:p>
+    <w:p>
+      <w:pPr>
         <w:numPr>
           <w:ilvl w:val="1"/>
           <w:numId w:val="1016"/>
         </w:numPr>
+        <w:pStyle w:val="Compact"/>
       </w:pPr>
       <w:r>
         <w:t xml:space="preserve">should · b) shouldn’t</w:t>
@@ -1848,11 +2216,11 @@
     </w:p>
     <w:p>
       <w:pPr>
-        <w:pStyle w:val="Compact"/>
         <w:numPr>
           <w:ilvl w:val="0"/>
           <w:numId w:val="1011"/>
         </w:numPr>
+        <w:pStyle w:val="Compact"/>
       </w:pPr>
       <w:r>
         <w:t xml:space="preserve">I don’t like onions, but I love corn.</w:t>
@@ -1860,11 +2228,11 @@
     </w:p>
     <w:p>
       <w:pPr>
-        <w:pStyle w:val="Compact"/>
         <w:numPr>
           <w:ilvl w:val="0"/>
           <w:numId w:val="1011"/>
         </w:numPr>
+        <w:pStyle w:val="Compact"/>
       </w:pPr>
       <w:r>
         <w:t xml:space="preserve">Respuesta abierta. Ejemplo:</w:t>
@@ -1874,14 +2242,14 @@
       </w:r>
       <w:r>
         <w:rPr>
+          <w:iCs/>
           <w:i/>
-          <w:iCs/>
         </w:rPr>
         <w:t xml:space="preserve">A healthy lunch has vegetables, rice and chicken. There is a glass of water on the table. I always eat fruit after lunch.</w:t>
       </w:r>
     </w:p>
-    <w:bookmarkEnd w:id="21"/>
-    <w:bookmarkStart w:id="22" w:name="parte-vi-sección-integradora"/>
+    <w:bookmarkEnd w:id="37"/>
+    <w:bookmarkStart w:id="38" w:name="parte-vi-sección-integradora"/>
     <w:p>
       <w:pPr>
         <w:pStyle w:val="Heading2"/>
@@ -1892,11 +2260,11 @@
     </w:p>
     <w:p>
       <w:pPr>
-        <w:pStyle w:val="Compact"/>
         <w:numPr>
           <w:ilvl w:val="0"/>
           <w:numId w:val="1017"/>
         </w:numPr>
+        <w:pStyle w:val="Compact"/>
       </w:pPr>
       <w:r>
         <w:t xml:space="preserve">Verduras y frutas: la mitad de 400 g =</w:t>
@@ -1906,8 +2274,8 @@
       </w:r>
       <w:r>
         <w:rPr>
+          <w:bCs/>
           <w:b/>
-          <w:bCs/>
         </w:rPr>
         <w:t xml:space="preserve">200 g</w:t>
       </w:r>
@@ -1919,8 +2287,8 @@
       </w:r>
       <w:r>
         <w:rPr>
+          <w:bCs/>
           <w:b/>
-          <w:bCs/>
         </w:rPr>
         <w:t xml:space="preserve">100 g</w:t>
       </w:r>
@@ -1930,11 +2298,11 @@
     </w:p>
     <w:p>
       <w:pPr>
-        <w:pStyle w:val="Compact"/>
         <w:numPr>
           <w:ilvl w:val="0"/>
           <w:numId w:val="1017"/>
         </w:numPr>
+        <w:pStyle w:val="Compact"/>
       </w:pPr>
       <w:r>
         <w:t xml:space="preserve">Por ejemplo: lettuce, rice, chicken (también tomato, carrot, fish, bread).</w:t>
@@ -1942,11 +2310,11 @@
     </w:p>
     <w:p>
       <w:pPr>
-        <w:pStyle w:val="Compact"/>
         <w:numPr>
           <w:ilvl w:val="0"/>
           <w:numId w:val="1017"/>
         </w:numPr>
+        <w:pStyle w:val="Compact"/>
       </w:pPr>
       <w:r>
         <w:t xml:space="preserve">Por ejemplo, papa y maíz. En inglés: potato / corn. También sirven tomate (tomato) y cacao (cocoa).</w:t>
@@ -1954,11 +2322,11 @@
     </w:p>
     <w:p>
       <w:pPr>
-        <w:pStyle w:val="Compact"/>
         <w:numPr>
           <w:ilvl w:val="0"/>
           <w:numId w:val="1017"/>
         </w:numPr>
+        <w:pStyle w:val="Compact"/>
       </w:pPr>
       <w:r>
         <w:t xml:space="preserve">Respuesta abierta. Debe reemplazar un elemento por otro sin usar nexo, por ejemplo</w:t>
@@ -1968,8 +2336,8 @@
       </w:r>
       <w:r>
         <w:rPr>
+          <w:iCs/>
           <w:i/>
-          <w:iCs/>
         </w:rPr>
         <w:t xml:space="preserve">el océano era un desierto de agua</w:t>
       </w:r>
@@ -1979,11 +2347,11 @@
     </w:p>
     <w:p>
       <w:pPr>
-        <w:pStyle w:val="Compact"/>
         <w:numPr>
           <w:ilvl w:val="0"/>
           <w:numId w:val="1017"/>
         </w:numPr>
+        <w:pStyle w:val="Compact"/>
       </w:pPr>
       <w:r>
         <w:t xml:space="preserve">28 días de agosto + 30 de septiembre + 12 de octubre =</w:t>
@@ -1993,8 +2361,8 @@
       </w:r>
       <w:r>
         <w:rPr>
+          <w:bCs/>
           <w:b/>
-          <w:bCs/>
         </w:rPr>
         <w:t xml:space="preserve">70 días</w:t>
       </w:r>
@@ -2009,8 +2377,8 @@
         </w:pict>
       </w:r>
     </w:p>
-    <w:bookmarkEnd w:id="22"/>
-    <w:bookmarkStart w:id="23" w:name="tabla-de-resultados"/>
+    <w:bookmarkEnd w:id="38"/>
+    <w:bookmarkStart w:id="39" w:name="tabla-de-resultados"/>
     <w:p>
       <w:pPr>
         <w:pStyle w:val="Heading2"/>
@@ -2024,6 +2392,7 @@
         <w:tblStyle w:val="Table"/>
         <w:tblW w:type="auto" w:w="0"/>
         <w:tblLook w:firstRow="1" w:lastRow="0" w:firstColumn="0" w:lastColumn="0" w:noHBand="0" w:noVBand="0" w:val="0020"/>
+        <w:jc w:val="start"/>
       </w:tblPr>
       <w:tblGrid>
         <w:gridCol w:w="1980"/>
@@ -2033,13 +2402,14 @@
       </w:tblGrid>
       <w:tr>
         <w:trPr>
-          <w:tblHeader w:val="on"/>
+          <w:tblHeader w:val="true"/>
         </w:trPr>
         <w:tc>
           <w:tcPr/>
           <w:p>
             <w:pPr>
               <w:pStyle w:val="Compact"/>
+              <w:jc w:val="left"/>
             </w:pPr>
             <w:r>
               <w:t xml:space="preserve">Parte</w:t>
@@ -2051,6 +2421,7 @@
           <w:p>
             <w:pPr>
               <w:pStyle w:val="Compact"/>
+              <w:jc w:val="left"/>
             </w:pPr>
             <w:r>
               <w:t xml:space="preserve">Asignatura</w:t>
@@ -2062,6 +2433,7 @@
           <w:p>
             <w:pPr>
               <w:pStyle w:val="Compact"/>
+              <w:jc w:val="left"/>
             </w:pPr>
             <w:r>
               <w:t xml:space="preserve">Puntaje obtenido</w:t>
@@ -2073,6 +2445,7 @@
           <w:p>
             <w:pPr>
               <w:pStyle w:val="Compact"/>
+              <w:jc w:val="left"/>
             </w:pPr>
             <w:r>
               <w:t xml:space="preserve">Puntaje máximo</w:t>
@@ -2086,6 +2459,7 @@
           <w:p>
             <w:pPr>
               <w:pStyle w:val="Compact"/>
+              <w:jc w:val="left"/>
             </w:pPr>
             <w:r>
               <w:t xml:space="preserve">I</w:t>
@@ -2097,6 +2471,7 @@
           <w:p>
             <w:pPr>
               <w:pStyle w:val="Compact"/>
+              <w:jc w:val="left"/>
             </w:pPr>
             <w:r>
               <w:t xml:space="preserve">Matemáticas</w:t>
@@ -2116,6 +2491,7 @@
           <w:p>
             <w:pPr>
               <w:pStyle w:val="Compact"/>
+              <w:jc w:val="left"/>
             </w:pPr>
             <w:r>
               <w:t xml:space="preserve">10</w:t>
@@ -2129,6 +2505,7 @@
           <w:p>
             <w:pPr>
               <w:pStyle w:val="Compact"/>
+              <w:jc w:val="left"/>
             </w:pPr>
             <w:r>
               <w:t xml:space="preserve">II</w:t>
@@ -2140,6 +2517,7 @@
           <w:p>
             <w:pPr>
               <w:pStyle w:val="Compact"/>
+              <w:jc w:val="left"/>
             </w:pPr>
             <w:r>
               <w:t xml:space="preserve">Lenguaje</w:t>
@@ -2159,6 +2537,7 @@
           <w:p>
             <w:pPr>
               <w:pStyle w:val="Compact"/>
+              <w:jc w:val="left"/>
             </w:pPr>
             <w:r>
               <w:t xml:space="preserve">10</w:t>
@@ -2172,6 +2551,7 @@
           <w:p>
             <w:pPr>
               <w:pStyle w:val="Compact"/>
+              <w:jc w:val="left"/>
             </w:pPr>
             <w:r>
               <w:t xml:space="preserve">III</w:t>
@@ -2183,6 +2563,7 @@
           <w:p>
             <w:pPr>
               <w:pStyle w:val="Compact"/>
+              <w:jc w:val="left"/>
             </w:pPr>
             <w:r>
               <w:t xml:space="preserve">Ciencias Naturales</w:t>
@@ -2202,6 +2583,7 @@
           <w:p>
             <w:pPr>
               <w:pStyle w:val="Compact"/>
+              <w:jc w:val="left"/>
             </w:pPr>
             <w:r>
               <w:t xml:space="preserve">10</w:t>
@@ -2215,6 +2597,7 @@
           <w:p>
             <w:pPr>
               <w:pStyle w:val="Compact"/>
+              <w:jc w:val="left"/>
             </w:pPr>
             <w:r>
               <w:t xml:space="preserve">IV</w:t>
@@ -2226,6 +2609,7 @@
           <w:p>
             <w:pPr>
               <w:pStyle w:val="Compact"/>
+              <w:jc w:val="left"/>
             </w:pPr>
             <w:r>
               <w:t xml:space="preserve">Historia</w:t>
@@ -2245,6 +2629,7 @@
           <w:p>
             <w:pPr>
               <w:pStyle w:val="Compact"/>
+              <w:jc w:val="left"/>
             </w:pPr>
             <w:r>
               <w:t xml:space="preserve">10</w:t>
@@ -2258,6 +2643,7 @@
           <w:p>
             <w:pPr>
               <w:pStyle w:val="Compact"/>
+              <w:jc w:val="left"/>
             </w:pPr>
             <w:r>
               <w:t xml:space="preserve">V</w:t>
@@ -2269,6 +2655,7 @@
           <w:p>
             <w:pPr>
               <w:pStyle w:val="Compact"/>
+              <w:jc w:val="left"/>
             </w:pPr>
             <w:r>
               <w:t xml:space="preserve">Inglés</w:t>
@@ -2288,6 +2675,7 @@
           <w:p>
             <w:pPr>
               <w:pStyle w:val="Compact"/>
+              <w:jc w:val="left"/>
             </w:pPr>
             <w:r>
               <w:t xml:space="preserve">10</w:t>
@@ -2301,6 +2689,7 @@
           <w:p>
             <w:pPr>
               <w:pStyle w:val="Compact"/>
+              <w:jc w:val="left"/>
             </w:pPr>
             <w:r>
               <w:t xml:space="preserve">VI</w:t>
@@ -2312,6 +2701,7 @@
           <w:p>
             <w:pPr>
               <w:pStyle w:val="Compact"/>
+              <w:jc w:val="left"/>
             </w:pPr>
             <w:r>
               <w:t xml:space="preserve">Integradora</w:t>
@@ -2331,6 +2721,7 @@
           <w:p>
             <w:pPr>
               <w:pStyle w:val="Compact"/>
+              <w:jc w:val="left"/>
             </w:pPr>
             <w:r>
               <w:t xml:space="preserve">5</w:t>
@@ -2352,11 +2743,12 @@
           <w:p>
             <w:pPr>
               <w:pStyle w:val="Compact"/>
+              <w:jc w:val="left"/>
             </w:pPr>
             <w:r>
               <w:rPr>
+                <w:bCs/>
                 <w:b/>
-                <w:bCs/>
               </w:rPr>
               <w:t xml:space="preserve">Total</w:t>
             </w:r>
@@ -2375,11 +2767,12 @@
           <w:p>
             <w:pPr>
               <w:pStyle w:val="Compact"/>
+              <w:jc w:val="left"/>
             </w:pPr>
             <w:r>
               <w:rPr>
+                <w:bCs/>
                 <w:b/>
-                <w:bCs/>
               </w:rPr>
               <w:t xml:space="preserve">55</w:t>
             </w:r>
@@ -2387,8 +2780,8 @@
         </w:tc>
       </w:tr>
     </w:tbl>
-    <w:bookmarkEnd w:id="23"/>
-    <w:bookmarkStart w:id="24" w:name="interpretación"/>
+    <w:bookmarkEnd w:id="39"/>
+    <w:bookmarkStart w:id="40" w:name="interpretación"/>
     <w:p>
       <w:pPr>
         <w:pStyle w:val="Heading2"/>
@@ -2401,8 +2794,8 @@
       <w:tblPr>
         <w:tblStyle w:val="Table"/>
         <w:tblW w:type="pct" w:w="5000"/>
-        <w:tblLayout w:type="fixed"/>
         <w:tblLook w:firstRow="1" w:lastRow="0" w:firstColumn="0" w:lastColumn="0" w:noHBand="0" w:noVBand="0" w:val="0020"/>
+        <w:jc w:val="start"/>
       </w:tblPr>
       <w:tblGrid>
         <w:gridCol w:w="2640"/>
@@ -2411,13 +2804,14 @@
       </w:tblGrid>
       <w:tr>
         <w:trPr>
-          <w:tblHeader w:val="on"/>
+          <w:tblHeader w:val="true"/>
         </w:trPr>
         <w:tc>
           <w:tcPr/>
           <w:p>
             <w:pPr>
               <w:pStyle w:val="Compact"/>
+              <w:jc w:val="left"/>
             </w:pPr>
             <w:r>
               <w:t xml:space="preserve">Puntaje</w:t>
@@ -2429,6 +2823,7 @@
           <w:p>
             <w:pPr>
               <w:pStyle w:val="Compact"/>
+              <w:jc w:val="left"/>
             </w:pPr>
             <w:r>
               <w:t xml:space="preserve">Qué significa</w:t>
@@ -2440,6 +2835,7 @@
           <w:p>
             <w:pPr>
               <w:pStyle w:val="Compact"/>
+              <w:jc w:val="left"/>
             </w:pPr>
             <w:r>
               <w:t xml:space="preserve">Qué hacer</w:t>
@@ -2453,6 +2849,7 @@
           <w:p>
             <w:pPr>
               <w:pStyle w:val="Compact"/>
+              <w:jc w:val="left"/>
             </w:pPr>
             <w:r>
               <w:t xml:space="preserve">47 a 55</w:t>
@@ -2464,6 +2861,7 @@
           <w:p>
             <w:pPr>
               <w:pStyle w:val="Compact"/>
+              <w:jc w:val="left"/>
             </w:pPr>
             <w:r>
               <w:t xml:space="preserve">Dominio sólido de todos los contenidos</w:t>
@@ -2475,6 +2873,7 @@
           <w:p>
             <w:pPr>
               <w:pStyle w:val="Compact"/>
+              <w:jc w:val="left"/>
             </w:pPr>
             <w:r>
               <w:t xml:space="preserve">Cerrar el repaso; mantener lectura y práctica ligera</w:t>
@@ -2488,6 +2887,7 @@
           <w:p>
             <w:pPr>
               <w:pStyle w:val="Compact"/>
+              <w:jc w:val="left"/>
             </w:pPr>
             <w:r>
               <w:t xml:space="preserve">36 a 46</w:t>
@@ -2499,6 +2899,7 @@
           <w:p>
             <w:pPr>
               <w:pStyle w:val="Compact"/>
+              <w:jc w:val="left"/>
             </w:pPr>
             <w:r>
               <w:t xml:space="preserve">Dominio general con vacíos puntuales</w:t>
@@ -2510,6 +2911,7 @@
           <w:p>
             <w:pPr>
               <w:pStyle w:val="Compact"/>
+              <w:jc w:val="left"/>
             </w:pPr>
             <w:r>
               <w:t xml:space="preserve">Revisar solo las partes con menos de 7 puntos</w:t>
@@ -2523,6 +2925,7 @@
           <w:p>
             <w:pPr>
               <w:pStyle w:val="Compact"/>
+              <w:jc w:val="left"/>
             </w:pPr>
             <w:r>
               <w:t xml:space="preserve">25 a 35</w:t>
@@ -2534,6 +2937,7 @@
           <w:p>
             <w:pPr>
               <w:pStyle w:val="Compact"/>
+              <w:jc w:val="left"/>
             </w:pPr>
             <w:r>
               <w:t xml:space="preserve">Contenidos parcialmente logrados</w:t>
@@ -2545,6 +2949,7 @@
           <w:p>
             <w:pPr>
               <w:pStyle w:val="Compact"/>
+              <w:jc w:val="left"/>
             </w:pPr>
             <w:r>
               <w:t xml:space="preserve">Rehacer las secciones indicadas en las guías correspondientes</w:t>
@@ -2558,6 +2963,7 @@
           <w:p>
             <w:pPr>
               <w:pStyle w:val="Compact"/>
+              <w:jc w:val="left"/>
             </w:pPr>
             <w:r>
               <w:t xml:space="preserve">Menos de 25</w:t>
@@ -2569,6 +2975,7 @@
           <w:p>
             <w:pPr>
               <w:pStyle w:val="Compact"/>
+              <w:jc w:val="left"/>
             </w:pPr>
             <w:r>
               <w:t xml:space="preserve">Se requiere repaso completo</w:t>
@@ -2580,6 +2987,7 @@
           <w:p>
             <w:pPr>
               <w:pStyle w:val="Compact"/>
+              <w:jc w:val="left"/>
             </w:pPr>
             <w:r>
               <w:t xml:space="preserve">Volver a la Semana 1 del plan con sesiones más cortas</w:t>
@@ -2594,8 +3002,8 @@
       </w:pPr>
       <w:r>
         <w:rPr>
+          <w:bCs/>
           <w:b/>
-          <w:bCs/>
         </w:rPr>
         <w:t xml:space="preserve">Nota para el adulto.</w:t>
       </w:r>
@@ -2606,13 +3014,9 @@
         <w:t xml:space="preserve">Conviene revisar la evaluación junto a Bego el mismo día, pregunta por pregunta. El objetivo no es la nota, sino identificar con precisión qué contenido volver a trabajar. La tabla de remediación de cada guía indica exactamente a qué sección regresar.</w:t>
       </w:r>
     </w:p>
-    <w:bookmarkEnd w:id="24"/>
-    <w:bookmarkEnd w:id="25"/>
-    <w:sectPr>
-      <w:footnotePr>
-        <w:numRestart w:val="eachSect"/>
-      </w:footnotePr>
-    </w:sectPr>
+    <w:bookmarkEnd w:id="40"/>
+    <w:bookmarkEnd w:id="41"/>
+    <w:sectPr/>
   </w:body>
 </w:document>
 </file>
@@ -2643,14 +3047,14 @@
 <file path=word/numbering.xml><?xml version="1.0" encoding="utf-8"?>
 <w:numbering xmlns:w="http://schemas.openxmlformats.org/wordprocessingml/2006/main">
   <w:abstractNum w:abstractNumId="990">
-    <w:nsid w:val="0000A990"/>
+    <w:nsid w:val="A990"/>
     <w:multiLevelType w:val="multilevel"/>
     <w:lvl w:ilvl="0">
       <w:numFmt w:val="bullet"/>
       <w:lvlText w:val=" "/>
       <w:lvlJc w:val="left"/>
       <w:pPr>
-        <w:ind w:left="720" w:hanging="360"/>
+        <w:ind w:left="720" w:hanging="480"/>
       </w:pPr>
     </w:lvl>
     <w:lvl w:ilvl="1">
@@ -2658,7 +3062,7 @@
       <w:lvlText w:val=" "/>
       <w:lvlJc w:val="left"/>
       <w:pPr>
-        <w:ind w:left="1440" w:hanging="360"/>
+        <w:ind w:left="1440" w:hanging="480"/>
       </w:pPr>
     </w:lvl>
     <w:lvl w:ilvl="2">
@@ -2666,7 +3070,7 @@
       <w:lvlText w:val=" "/>
       <w:lvlJc w:val="left"/>
       <w:pPr>
-        <w:ind w:left="2160" w:hanging="360"/>
+        <w:ind w:left="2160" w:hanging="480"/>
       </w:pPr>
     </w:lvl>
     <w:lvl w:ilvl="3">
@@ -2674,7 +3078,7 @@
       <w:lvlText w:val=" "/>
       <w:lvlJc w:val="left"/>
       <w:pPr>
-        <w:ind w:left="2880" w:hanging="360"/>
+        <w:ind w:left="2880" w:hanging="480"/>
       </w:pPr>
     </w:lvl>
     <w:lvl w:ilvl="4">
@@ -2682,7 +3086,7 @@
       <w:lvlText w:val=" "/>
       <w:lvlJc w:val="left"/>
       <w:pPr>
-        <w:ind w:left="3600" w:hanging="360"/>
+        <w:ind w:left="3600" w:hanging="480"/>
       </w:pPr>
     </w:lvl>
     <w:lvl w:ilvl="5">
@@ -2690,7 +3094,7 @@
       <w:lvlText w:val=" "/>
       <w:lvlJc w:val="left"/>
       <w:pPr>
-        <w:ind w:left="4320" w:hanging="360"/>
+        <w:ind w:left="4320" w:hanging="480"/>
       </w:pPr>
     </w:lvl>
     <w:lvl w:ilvl="6">
@@ -2698,7 +3102,7 @@
       <w:lvlText w:val=" "/>
       <w:lvlJc w:val="left"/>
       <w:pPr>
-        <w:ind w:left="5040" w:hanging="360"/>
+        <w:ind w:left="5040" w:hanging="480"/>
       </w:pPr>
     </w:lvl>
     <w:lvl w:ilvl="7">
@@ -2706,7 +3110,7 @@
       <w:lvlText w:val=" "/>
       <w:lvlJc w:val="left"/>
       <w:pPr>
-        <w:ind w:left="5760" w:hanging="360"/>
+        <w:ind w:left="5760" w:hanging="480"/>
       </w:pPr>
     </w:lvl>
     <w:lvl w:ilvl="8">
@@ -2714,12 +3118,12 @@
       <w:lvlText w:val=" "/>
       <w:lvlJc w:val="left"/>
       <w:pPr>
-        <w:ind w:left="6480" w:hanging="360"/>
+        <w:ind w:left="6480" w:hanging="480"/>
       </w:pPr>
     </w:lvl>
   </w:abstractNum>
   <w:abstractNum w:abstractNumId="99411">
-    <w:nsid w:val="00A99411"/>
+    <w:nsid w:val="A99411"/>
     <w:multiLevelType w:val="multilevel"/>
     <w:lvl w:ilvl="0">
       <w:start w:val="1"/>
@@ -2727,7 +3131,7 @@
       <w:lvlText w:val="%1."/>
       <w:lvlJc w:val="left"/>
       <w:pPr>
-        <w:ind w:left="720" w:hanging="360"/>
+        <w:ind w:left="720" w:hanging="480"/>
       </w:pPr>
     </w:lvl>
     <w:lvl w:ilvl="1">
@@ -2736,7 +3140,7 @@
       <w:lvlText w:val="%2."/>
       <w:lvlJc w:val="left"/>
       <w:pPr>
-        <w:ind w:left="1440" w:hanging="360"/>
+        <w:ind w:left="1440" w:hanging="480"/>
       </w:pPr>
     </w:lvl>
     <w:lvl w:ilvl="2">
@@ -2745,7 +3149,7 @@
       <w:lvlText w:val="%3."/>
       <w:lvlJc w:val="left"/>
       <w:pPr>
-        <w:ind w:left="2160" w:hanging="360"/>
+        <w:ind w:left="2160" w:hanging="480"/>
       </w:pPr>
     </w:lvl>
     <w:lvl w:ilvl="3">
@@ -2754,7 +3158,7 @@
       <w:lvlText w:val="%4."/>
       <w:lvlJc w:val="left"/>
       <w:pPr>
-        <w:ind w:left="2880" w:hanging="360"/>
+        <w:ind w:left="2880" w:hanging="480"/>
       </w:pPr>
     </w:lvl>
     <w:lvl w:ilvl="4">
@@ -2763,7 +3167,7 @@
       <w:lvlText w:val="%5."/>
       <w:lvlJc w:val="left"/>
       <w:pPr>
-        <w:ind w:left="3600" w:hanging="360"/>
+        <w:ind w:left="3600" w:hanging="480"/>
       </w:pPr>
     </w:lvl>
     <w:lvl w:ilvl="5">
@@ -2772,7 +3176,7 @@
       <w:lvlText w:val="%6."/>
       <w:lvlJc w:val="left"/>
       <w:pPr>
-        <w:ind w:left="4320" w:hanging="360"/>
+        <w:ind w:left="4320" w:hanging="480"/>
       </w:pPr>
     </w:lvl>
     <w:lvl w:ilvl="6">
@@ -2781,7 +3185,7 @@
       <w:lvlText w:val="%7."/>
       <w:lvlJc w:val="left"/>
       <w:pPr>
-        <w:ind w:left="5040" w:hanging="360"/>
+        <w:ind w:left="5040" w:hanging="480"/>
       </w:pPr>
     </w:lvl>
     <w:lvl w:ilvl="7">
@@ -2790,7 +3194,7 @@
       <w:lvlText w:val="%8."/>
       <w:lvlJc w:val="left"/>
       <w:pPr>
-        <w:ind w:left="5760" w:hanging="360"/>
+        <w:ind w:left="5760" w:hanging="480"/>
       </w:pPr>
     </w:lvl>
     <w:lvl w:ilvl="8">
@@ -2799,12 +3203,12 @@
       <w:lvlText w:val="%9."/>
       <w:lvlJc w:val="left"/>
       <w:pPr>
-        <w:ind w:left="6480" w:hanging="360"/>
+        <w:ind w:left="6480" w:hanging="480"/>
       </w:pPr>
     </w:lvl>
   </w:abstractNum>
   <w:abstractNum w:abstractNumId="99721">
-    <w:nsid w:val="00A99721"/>
+    <w:nsid w:val="A99721"/>
     <w:multiLevelType w:val="multilevel"/>
     <w:lvl w:ilvl="0">
       <w:start w:val="1"/>
@@ -2812,7 +3216,7 @@
       <w:lvlText w:val="%1)"/>
       <w:lvlJc w:val="left"/>
       <w:pPr>
-        <w:ind w:left="720" w:hanging="360"/>
+        <w:ind w:left="720" w:hanging="480"/>
       </w:pPr>
     </w:lvl>
     <w:lvl w:ilvl="1">
@@ -2821,7 +3225,7 @@
       <w:lvlText w:val="%2)"/>
       <w:lvlJc w:val="left"/>
       <w:pPr>
-        <w:ind w:left="1440" w:hanging="360"/>
+        <w:ind w:left="1440" w:hanging="480"/>
       </w:pPr>
     </w:lvl>
     <w:lvl w:ilvl="2">
@@ -2830,7 +3234,7 @@
       <w:lvlText w:val="%3)"/>
       <w:lvlJc w:val="left"/>
       <w:pPr>
-        <w:ind w:left="2160" w:hanging="360"/>
+        <w:ind w:left="2160" w:hanging="480"/>
       </w:pPr>
     </w:lvl>
     <w:lvl w:ilvl="3">
@@ -2839,7 +3243,7 @@
       <w:lvlText w:val="%4)"/>
       <w:lvlJc w:val="left"/>
       <w:pPr>
-        <w:ind w:left="2880" w:hanging="360"/>
+        <w:ind w:left="2880" w:hanging="480"/>
       </w:pPr>
     </w:lvl>
     <w:lvl w:ilvl="4">
@@ -2848,7 +3252,7 @@
       <w:lvlText w:val="%5)"/>
       <w:lvlJc w:val="left"/>
       <w:pPr>
-        <w:ind w:left="3600" w:hanging="360"/>
+        <w:ind w:left="3600" w:hanging="480"/>
       </w:pPr>
     </w:lvl>
     <w:lvl w:ilvl="5">
@@ -2857,7 +3261,7 @@
       <w:lvlText w:val="%6)"/>
       <w:lvlJc w:val="left"/>
       <w:pPr>
-        <w:ind w:left="4320" w:hanging="360"/>
+        <w:ind w:left="4320" w:hanging="480"/>
       </w:pPr>
     </w:lvl>
     <w:lvl w:ilvl="6">
@@ -2866,7 +3270,7 @@
       <w:lvlText w:val="%7)"/>
       <w:lvlJc w:val="left"/>
       <w:pPr>
-        <w:ind w:left="5040" w:hanging="360"/>
+        <w:ind w:left="5040" w:hanging="480"/>
       </w:pPr>
     </w:lvl>
     <w:lvl w:ilvl="7">
@@ -2875,7 +3279,7 @@
       <w:lvlText w:val="%8)"/>
       <w:lvlJc w:val="left"/>
       <w:pPr>
-        <w:ind w:left="5760" w:hanging="360"/>
+        <w:ind w:left="5760" w:hanging="480"/>
       </w:pPr>
     </w:lvl>
     <w:lvl w:ilvl="8">
@@ -2884,7 +3288,7 @@
       <w:lvlText w:val="%9)"/>
       <w:lvlJc w:val="left"/>
       <w:pPr>
-        <w:ind w:left="6480" w:hanging="360"/>
+        <w:ind w:left="6480" w:hanging="480"/>
       </w:pPr>
     </w:lvl>
   </w:abstractNum>
@@ -3409,10 +3813,10 @@
   <w:docDefaults>
     <w:rPrDefault>
       <w:rPr>
-        <w:rFonts w:asciiTheme="minorHAnsi" w:cstheme="minorBidi" w:eastAsiaTheme="minorEastAsia" w:hAnsiTheme="minorHAnsi"/>
+        <w:rFonts w:asciiTheme="minorHAnsi" w:cstheme="minorBidi" w:eastAsiaTheme="minorHAnsi" w:hAnsiTheme="minorHAnsi"/>
         <w:sz w:val="24"/>
         <w:szCs w:val="24"/>
-        <w:lang w:bidi="ar-SA" w:eastAsia="zh-CN" w:val="en-US"/>
+        <w:lang w:bidi="ar-SA" w:eastAsia="en-US" w:val="en-US"/>
       </w:rPr>
     </w:rPrDefault>
     <w:pPrDefault>
@@ -3430,10 +3834,10 @@
     <w:name w:val="Body Text"/>
     <w:basedOn w:val="Normal"/>
     <w:link w:val="BodyTextChar"/>
-    <w:qFormat/>
     <w:pPr>
       <w:spacing w:after="180" w:before="180"/>
     </w:pPr>
+    <w:qFormat/>
   </w:style>
   <w:style w:customStyle="1" w:styleId="FirstParagraph" w:type="paragraph">
     <w:name w:val="First Paragraph"/>
@@ -3453,94 +3857,57 @@
     <w:name w:val="Title"/>
     <w:basedOn w:val="Normal"/>
     <w:next w:val="BodyText"/>
-    <w:link w:val="TitleChar"/>
-    <w:uiPriority w:val="10"/>
     <w:qFormat/>
-    <w:rsid w:val="00A10FD9"/>
     <w:pPr>
-      <w:spacing w:after="80" w:line="240" w:lineRule="auto"/>
-      <w:contextualSpacing/>
+      <w:keepNext/>
+      <w:keepLines/>
+      <w:spacing w:after="240" w:before="480"/>
       <w:jc w:val="center"/>
     </w:pPr>
     <w:rPr>
       <w:rFonts w:asciiTheme="majorHAnsi" w:cstheme="majorBidi" w:eastAsiaTheme="majorEastAsia" w:hAnsiTheme="majorHAnsi"/>
-      <w:sz w:val="56"/>
-      <w:szCs w:val="56"/>
-    </w:rPr>
-  </w:style>
-  <w:style w:customStyle="1" w:styleId="TitleChar" w:type="character">
-    <w:name w:val="Title Char"/>
-    <w:basedOn w:val="DefaultParagraphFont"/>
-    <w:link w:val="Title"/>
-    <w:uiPriority w:val="10"/>
-    <w:rsid w:val="00A10FD9"/>
-    <w:rPr>
-      <w:rFonts w:asciiTheme="majorHAnsi" w:cstheme="majorBidi" w:eastAsiaTheme="majorEastAsia" w:hAnsiTheme="majorHAnsi"/>
-      <w:sz w:val="56"/>
-      <w:szCs w:val="56"/>
+      <w:b/>
+      <w:bCs/>
+      <w:color w:themeColor="accent1" w:themeShade="B5" w:val="345A8A"/>
+      <w:sz w:val="36"/>
+      <w:szCs w:val="36"/>
     </w:rPr>
   </w:style>
   <w:style w:styleId="Subtitle" w:type="paragraph">
     <w:name w:val="Subtitle"/>
-    <w:basedOn w:val="Title"/>
-    <w:next w:val="BodyText"/>
-    <w:link w:val="SubtitleChar"/>
-    <w:uiPriority w:val="11"/>
-    <w:qFormat/>
-    <w:rsid w:val="00A10FD9"/>
-    <w:pPr>
-      <w:numPr>
-        <w:ilvl w:val="1"/>
-      </w:numPr>
-    </w:pPr>
-    <w:rPr>
-      <w:rFonts w:cstheme="majorBidi" w:eastAsiaTheme="majorEastAsia"/>
-      <w:spacing w:val="15"/>
-      <w:sz w:val="28"/>
-      <w:szCs w:val="28"/>
-    </w:rPr>
-  </w:style>
-  <w:style w:customStyle="1" w:styleId="SubtitleChar" w:type="character">
-    <w:name w:val="Subtitle Char"/>
-    <w:basedOn w:val="DefaultParagraphFont"/>
-    <w:link w:val="Subtitle"/>
-    <w:uiPriority w:val="11"/>
-    <w:rsid w:val="00A10FD9"/>
-    <w:rPr>
-      <w:rFonts w:cstheme="majorBidi" w:eastAsiaTheme="majorEastAsia"/>
-      <w:color w:themeColor="text1" w:themeTint="A6" w:val="595959"/>
-      <w:spacing w:val="15"/>
-      <w:sz w:val="28"/>
-      <w:szCs w:val="28"/>
-    </w:rPr>
-  </w:style>
-  <w:style w:customStyle="1" w:styleId="Author" w:type="paragraph">
-    <w:name w:val="Author"/>
     <w:basedOn w:val="Title"/>
     <w:next w:val="BodyText"/>
     <w:qFormat/>
     <w:pPr>
       <w:keepNext/>
       <w:keepLines/>
+      <w:spacing w:after="240" w:before="240"/>
+      <w:jc w:val="center"/>
     </w:pPr>
     <w:rPr>
-      <w:sz w:val="24"/>
-      <w:szCs w:val="24"/>
+      <w:sz w:val="30"/>
+      <w:szCs w:val="30"/>
     </w:rPr>
   </w:style>
-  <w:style w:styleId="Date" w:type="paragraph">
-    <w:name w:val="Date"/>
-    <w:basedOn w:val="Title"/>
+  <w:style w:customStyle="1" w:styleId="Author" w:type="paragraph">
+    <w:name w:val="Author"/>
     <w:next w:val="BodyText"/>
     <w:qFormat/>
     <w:pPr>
       <w:keepNext/>
       <w:keepLines/>
+      <w:jc w:val="center"/>
     </w:pPr>
-    <w:rPr>
-      <w:sz w:val="24"/>
-      <w:szCs w:val="24"/>
-    </w:rPr>
+  </w:style>
+  <w:style w:styleId="Date" w:type="paragraph">
+    <w:name w:val="Date"/>
+    <w:next w:val="BodyText"/>
+    <w:qFormat/>
+    <w:pPr>
+      <w:keepNext/>
+      <w:keepLines/>
+      <w:jc w:val="center"/>
+    </w:pPr>
   </w:style>
   <w:style w:customStyle="1" w:styleId="AbstractTitle" w:type="paragraph">
     <w:name w:val="Abstract Title"/>
@@ -3550,13 +3917,15 @@
     <w:pPr>
       <w:keepNext/>
       <w:keepLines/>
+      <w:jc w:val="center"/>
       <w:spacing w:after="0" w:before="300"/>
-      <w:jc w:val="center"/>
     </w:pPr>
     <w:rPr>
-      <w:b/>
       <w:sz w:val="20"/>
       <w:szCs w:val="20"/>
+      <w:b/>
+      <w:color w:val="345A8A"/>
+      &gt;
     </w:rPr>
   </w:style>
   <w:style w:customStyle="1" w:styleId="Abstract" w:type="paragraph">
@@ -3583,321 +3952,191 @@
     <w:rPr/>
   </w:style>
   <w:style w:styleId="Heading1" w:type="paragraph">
-    <w:name w:val="heading 1"/>
+    <w:name w:val="Heading 1"/>
     <w:basedOn w:val="Normal"/>
     <w:next w:val="BodyText"/>
-    <w:link w:val="Heading1Char"/>
     <w:uiPriority w:val="9"/>
     <w:qFormat/>
-    <w:rsid w:val="00A10FD9"/>
     <w:pPr>
       <w:keepNext/>
       <w:keepLines/>
-      <w:spacing w:after="80" w:before="360"/>
+      <w:spacing w:after="0" w:before="480"/>
       <w:outlineLvl w:val="0"/>
     </w:pPr>
     <w:rPr>
       <w:rFonts w:asciiTheme="majorHAnsi" w:cstheme="majorBidi" w:eastAsiaTheme="majorEastAsia" w:hAnsiTheme="majorHAnsi"/>
-      <w:color w:themeColor="accent1" w:themeShade="BF" w:val="0F4761"/>
-      <w:sz w:val="40"/>
-      <w:szCs w:val="40"/>
+      <w:b/>
+      <w:bCs/>
+      <w:color w:themeColor="accent1" w:val="4F81BD"/>
+      <w:sz w:val="32"/>
+      <w:szCs w:val="32"/>
     </w:rPr>
   </w:style>
   <w:style w:styleId="Heading2" w:type="paragraph">
-    <w:name w:val="heading 2"/>
+    <w:name w:val="Heading 2"/>
     <w:basedOn w:val="Normal"/>
     <w:next w:val="BodyText"/>
-    <w:link w:val="Heading2Char"/>
     <w:uiPriority w:val="9"/>
-    <w:semiHidden/>
     <w:unhideWhenUsed/>
     <w:qFormat/>
-    <w:rsid w:val="00A10FD9"/>
     <w:pPr>
       <w:keepNext/>
       <w:keepLines/>
-      <w:spacing w:after="80" w:before="160"/>
+      <w:spacing w:after="0" w:before="200"/>
       <w:outlineLvl w:val="1"/>
     </w:pPr>
     <w:rPr>
       <w:rFonts w:asciiTheme="majorHAnsi" w:cstheme="majorBidi" w:eastAsiaTheme="majorEastAsia" w:hAnsiTheme="majorHAnsi"/>
-      <w:color w:themeColor="accent1" w:themeShade="BF" w:val="0F4761"/>
-      <w:sz w:val="32"/>
-      <w:szCs w:val="32"/>
+      <w:b/>
+      <w:bCs/>
+      <w:color w:themeColor="accent1" w:val="4F81BD"/>
+      <w:sz w:val="28"/>
+      <w:szCs w:val="28"/>
     </w:rPr>
   </w:style>
   <w:style w:styleId="Heading3" w:type="paragraph">
-    <w:name w:val="heading 3"/>
+    <w:name w:val="Heading 3"/>
     <w:basedOn w:val="Normal"/>
     <w:next w:val="BodyText"/>
-    <w:link w:val="Heading3Char"/>
     <w:uiPriority w:val="9"/>
-    <w:semiHidden/>
     <w:unhideWhenUsed/>
     <w:qFormat/>
-    <w:rsid w:val="00A10FD9"/>
     <w:pPr>
       <w:keepNext/>
       <w:keepLines/>
-      <w:spacing w:after="80" w:before="160"/>
+      <w:spacing w:after="0" w:before="200"/>
       <w:outlineLvl w:val="2"/>
     </w:pPr>
     <w:rPr>
-      <w:rFonts w:cstheme="majorBidi" w:eastAsiaTheme="majorEastAsia"/>
-      <w:color w:themeColor="accent1" w:themeShade="BF" w:val="0F4761"/>
-      <w:sz w:val="28"/>
-      <w:szCs w:val="28"/>
+      <w:rFonts w:asciiTheme="majorHAnsi" w:cstheme="majorBidi" w:eastAsiaTheme="majorEastAsia" w:hAnsiTheme="majorHAnsi"/>
+      <w:b/>
+      <w:bCs/>
+      <w:color w:themeColor="accent1" w:val="4F81BD"/>
+      <w:sz w:val="24"/>
+      <w:szCs w:val="24"/>
     </w:rPr>
   </w:style>
   <w:style w:styleId="Heading4" w:type="paragraph">
-    <w:name w:val="heading 4"/>
+    <w:name w:val="Heading 4"/>
     <w:basedOn w:val="Normal"/>
     <w:next w:val="BodyText"/>
-    <w:link w:val="Heading4Char"/>
     <w:uiPriority w:val="9"/>
-    <w:semiHidden/>
     <w:unhideWhenUsed/>
     <w:qFormat/>
-    <w:rsid w:val="00A10FD9"/>
     <w:pPr>
       <w:keepNext/>
       <w:keepLines/>
-      <w:spacing w:after="40" w:before="80"/>
+      <w:spacing w:after="0" w:before="200"/>
       <w:outlineLvl w:val="3"/>
     </w:pPr>
     <w:rPr>
-      <w:rFonts w:cstheme="majorBidi" w:eastAsiaTheme="majorEastAsia"/>
+      <w:rFonts w:asciiTheme="majorHAnsi" w:cstheme="majorBidi" w:eastAsiaTheme="majorEastAsia" w:hAnsiTheme="majorHAnsi"/>
       <w:i/>
-      <w:iCs/>
-      <w:color w:themeColor="accent1" w:themeShade="BF" w:val="0F4761"/>
+      <w:bCs/>
+      <w:color w:themeColor="accent1" w:val="4F81BD"/>
+      <w:sz w:val="24"/>
+      <w:szCs w:val="24"/>
     </w:rPr>
   </w:style>
   <w:style w:styleId="Heading5" w:type="paragraph">
-    <w:name w:val="heading 5"/>
+    <w:name w:val="Heading 5"/>
     <w:basedOn w:val="Normal"/>
     <w:next w:val="BodyText"/>
-    <w:link w:val="Heading5Char"/>
     <w:uiPriority w:val="9"/>
-    <w:semiHidden/>
     <w:unhideWhenUsed/>
     <w:qFormat/>
-    <w:rsid w:val="00A10FD9"/>
     <w:pPr>
       <w:keepNext/>
       <w:keepLines/>
-      <w:spacing w:after="40" w:before="80"/>
+      <w:spacing w:after="0" w:before="200"/>
       <w:outlineLvl w:val="4"/>
     </w:pPr>
     <w:rPr>
-      <w:rFonts w:cstheme="majorBidi" w:eastAsiaTheme="majorEastAsia"/>
-      <w:color w:themeColor="accent1" w:themeShade="BF" w:val="0F4761"/>
+      <w:rFonts w:asciiTheme="majorHAnsi" w:cstheme="majorBidi" w:eastAsiaTheme="majorEastAsia" w:hAnsiTheme="majorHAnsi"/>
+      <w:iCs/>
+      <w:color w:themeColor="accent1" w:val="4F81BD"/>
+      <w:sz w:val="24"/>
+      <w:szCs w:val="24"/>
     </w:rPr>
   </w:style>
   <w:style w:styleId="Heading6" w:type="paragraph">
-    <w:name w:val="heading 6"/>
+    <w:name w:val="Heading 6"/>
     <w:basedOn w:val="Normal"/>
     <w:next w:val="BodyText"/>
-    <w:link w:val="Heading6Char"/>
     <w:uiPriority w:val="9"/>
-    <w:semiHidden/>
     <w:unhideWhenUsed/>
     <w:qFormat/>
-    <w:rsid w:val="00A10FD9"/>
     <w:pPr>
       <w:keepNext/>
       <w:keepLines/>
-      <w:spacing w:after="0" w:before="40"/>
+      <w:spacing w:after="0" w:before="200"/>
       <w:outlineLvl w:val="5"/>
     </w:pPr>
     <w:rPr>
-      <w:rFonts w:cstheme="majorBidi" w:eastAsiaTheme="majorEastAsia"/>
-      <w:i/>
-      <w:iCs/>
-      <w:color w:themeColor="text1" w:themeTint="A6" w:val="595959"/>
+      <w:rFonts w:asciiTheme="majorHAnsi" w:cstheme="majorBidi" w:eastAsiaTheme="majorEastAsia" w:hAnsiTheme="majorHAnsi"/>
+      <w:color w:themeColor="accent1" w:val="4F81BD"/>
+      <w:sz w:val="24"/>
+      <w:szCs w:val="24"/>
     </w:rPr>
   </w:style>
   <w:style w:styleId="Heading7" w:type="paragraph">
-    <w:name w:val="heading 7"/>
+    <w:name w:val="Heading 7"/>
     <w:basedOn w:val="Normal"/>
     <w:next w:val="BodyText"/>
-    <w:link w:val="Heading7Char"/>
     <w:uiPriority w:val="9"/>
-    <w:semiHidden/>
     <w:unhideWhenUsed/>
     <w:qFormat/>
-    <w:rsid w:val="00A10FD9"/>
     <w:pPr>
       <w:keepNext/>
       <w:keepLines/>
-      <w:spacing w:after="0" w:before="40"/>
+      <w:spacing w:after="0" w:before="200"/>
       <w:outlineLvl w:val="6"/>
     </w:pPr>
     <w:rPr>
-      <w:rFonts w:cstheme="majorBidi" w:eastAsiaTheme="majorEastAsia"/>
-      <w:color w:themeColor="text1" w:themeTint="A6" w:val="595959"/>
+      <w:rFonts w:asciiTheme="majorHAnsi" w:cstheme="majorBidi" w:eastAsiaTheme="majorEastAsia" w:hAnsiTheme="majorHAnsi"/>
+      <w:color w:themeColor="accent1" w:val="4F81BD"/>
+      <w:sz w:val="24"/>
+      <w:szCs w:val="24"/>
     </w:rPr>
   </w:style>
   <w:style w:styleId="Heading8" w:type="paragraph">
-    <w:name w:val="heading 8"/>
+    <w:name w:val="Heading 8"/>
     <w:basedOn w:val="Normal"/>
     <w:next w:val="BodyText"/>
-    <w:link w:val="Heading8Char"/>
     <w:uiPriority w:val="9"/>
-    <w:semiHidden/>
     <w:unhideWhenUsed/>
     <w:qFormat/>
-    <w:rsid w:val="00A10FD9"/>
     <w:pPr>
       <w:keepNext/>
       <w:keepLines/>
-      <w:spacing w:after="0"/>
+      <w:spacing w:after="0" w:before="200"/>
       <w:outlineLvl w:val="7"/>
     </w:pPr>
     <w:rPr>
-      <w:rFonts w:cstheme="majorBidi" w:eastAsiaTheme="majorEastAsia"/>
-      <w:i/>
-      <w:iCs/>
-      <w:color w:themeColor="text1" w:themeTint="D8" w:val="272727"/>
+      <w:rFonts w:asciiTheme="majorHAnsi" w:cstheme="majorBidi" w:eastAsiaTheme="majorEastAsia" w:hAnsiTheme="majorHAnsi"/>
+      <w:color w:themeColor="accent1" w:val="4F81BD"/>
+      <w:sz w:val="24"/>
+      <w:szCs w:val="24"/>
     </w:rPr>
   </w:style>
   <w:style w:styleId="Heading9" w:type="paragraph">
-    <w:name w:val="heading 9"/>
+    <w:name w:val="Heading 9"/>
     <w:basedOn w:val="Normal"/>
     <w:next w:val="BodyText"/>
-    <w:link w:val="Heading9Char"/>
     <w:uiPriority w:val="9"/>
-    <w:semiHidden/>
     <w:unhideWhenUsed/>
     <w:qFormat/>
-    <w:rsid w:val="00A10FD9"/>
     <w:pPr>
       <w:keepNext/>
       <w:keepLines/>
-      <w:spacing w:after="0"/>
+      <w:spacing w:after="0" w:before="200"/>
       <w:outlineLvl w:val="8"/>
     </w:pPr>
     <w:rPr>
-      <w:rFonts w:cstheme="majorBidi" w:eastAsiaTheme="majorEastAsia"/>
-      <w:color w:themeColor="text1" w:themeTint="D8" w:val="272727"/>
-    </w:rPr>
-  </w:style>
-  <w:style w:customStyle="1" w:styleId="Heading1Char" w:type="character">
-    <w:name w:val="Heading 1 Char"/>
-    <w:basedOn w:val="DefaultParagraphFont"/>
-    <w:link w:val="Heading1"/>
-    <w:uiPriority w:val="9"/>
-    <w:rsid w:val="00A10FD9"/>
-    <w:rPr>
       <w:rFonts w:asciiTheme="majorHAnsi" w:cstheme="majorBidi" w:eastAsiaTheme="majorEastAsia" w:hAnsiTheme="majorHAnsi"/>
-      <w:color w:themeColor="accent1" w:themeShade="BF" w:val="0F4761"/>
-      <w:sz w:val="40"/>
-      <w:szCs w:val="40"/>
-    </w:rPr>
-  </w:style>
-  <w:style w:customStyle="1" w:styleId="Heading2Char" w:type="character">
-    <w:name w:val="Heading 2 Char"/>
-    <w:basedOn w:val="DefaultParagraphFont"/>
-    <w:link w:val="Heading2"/>
-    <w:uiPriority w:val="9"/>
-    <w:semiHidden/>
-    <w:rsid w:val="00A10FD9"/>
-    <w:rPr>
-      <w:rFonts w:asciiTheme="majorHAnsi" w:cstheme="majorBidi" w:eastAsiaTheme="majorEastAsia" w:hAnsiTheme="majorHAnsi"/>
-      <w:color w:themeColor="accent1" w:themeShade="BF" w:val="0F4761"/>
-      <w:sz w:val="32"/>
-      <w:szCs w:val="32"/>
-    </w:rPr>
-  </w:style>
-  <w:style w:customStyle="1" w:styleId="Heading3Char" w:type="character">
-    <w:name w:val="Heading 3 Char"/>
-    <w:basedOn w:val="DefaultParagraphFont"/>
-    <w:link w:val="Heading3"/>
-    <w:uiPriority w:val="9"/>
-    <w:semiHidden/>
-    <w:rsid w:val="00A10FD9"/>
-    <w:rPr>
-      <w:rFonts w:cstheme="majorBidi" w:eastAsiaTheme="majorEastAsia"/>
-      <w:color w:themeColor="accent1" w:themeShade="BF" w:val="0F4761"/>
-      <w:sz w:val="28"/>
-      <w:szCs w:val="28"/>
-    </w:rPr>
-  </w:style>
-  <w:style w:customStyle="1" w:styleId="Heading4Char" w:type="character">
-    <w:name w:val="Heading 4 Char"/>
-    <w:basedOn w:val="DefaultParagraphFont"/>
-    <w:link w:val="Heading4"/>
-    <w:uiPriority w:val="9"/>
-    <w:semiHidden/>
-    <w:rsid w:val="00A10FD9"/>
-    <w:rPr>
-      <w:rFonts w:cstheme="majorBidi" w:eastAsiaTheme="majorEastAsia"/>
-      <w:i/>
-      <w:iCs/>
-      <w:color w:themeColor="accent1" w:themeShade="BF" w:val="0F4761"/>
-    </w:rPr>
-  </w:style>
-  <w:style w:customStyle="1" w:styleId="Heading5Char" w:type="character">
-    <w:name w:val="Heading 5 Char"/>
-    <w:basedOn w:val="DefaultParagraphFont"/>
-    <w:link w:val="Heading5"/>
-    <w:uiPriority w:val="9"/>
-    <w:semiHidden/>
-    <w:rsid w:val="00A10FD9"/>
-    <w:rPr>
-      <w:rFonts w:cstheme="majorBidi" w:eastAsiaTheme="majorEastAsia"/>
-      <w:color w:themeColor="accent1" w:themeShade="BF" w:val="0F4761"/>
-    </w:rPr>
-  </w:style>
-  <w:style w:customStyle="1" w:styleId="Heading6Char" w:type="character">
-    <w:name w:val="Heading 6 Char"/>
-    <w:basedOn w:val="DefaultParagraphFont"/>
-    <w:link w:val="Heading6"/>
-    <w:uiPriority w:val="9"/>
-    <w:semiHidden/>
-    <w:rsid w:val="00A10FD9"/>
-    <w:rPr>
-      <w:rFonts w:cstheme="majorBidi" w:eastAsiaTheme="majorEastAsia"/>
-      <w:i/>
-      <w:iCs/>
-      <w:color w:themeColor="text1" w:themeTint="A6" w:val="595959"/>
-    </w:rPr>
-  </w:style>
-  <w:style w:customStyle="1" w:styleId="Heading7Char" w:type="character">
-    <w:name w:val="Heading 7 Char"/>
-    <w:basedOn w:val="DefaultParagraphFont"/>
-    <w:link w:val="Heading7"/>
-    <w:uiPriority w:val="9"/>
-    <w:semiHidden/>
-    <w:rsid w:val="00A10FD9"/>
-    <w:rPr>
-      <w:rFonts w:cstheme="majorBidi" w:eastAsiaTheme="majorEastAsia"/>
-      <w:color w:themeColor="text1" w:themeTint="A6" w:val="595959"/>
-    </w:rPr>
-  </w:style>
-  <w:style w:customStyle="1" w:styleId="Heading8Char" w:type="character">
-    <w:name w:val="Heading 8 Char"/>
-    <w:basedOn w:val="DefaultParagraphFont"/>
-    <w:link w:val="Heading8"/>
-    <w:uiPriority w:val="9"/>
-    <w:semiHidden/>
-    <w:rsid w:val="00A10FD9"/>
-    <w:rPr>
-      <w:rFonts w:cstheme="majorBidi" w:eastAsiaTheme="majorEastAsia"/>
-      <w:i/>
-      <w:iCs/>
-      <w:color w:themeColor="text1" w:themeTint="D8" w:val="272727"/>
-    </w:rPr>
-  </w:style>
-  <w:style w:customStyle="1" w:styleId="Heading9Char" w:type="character">
-    <w:name w:val="Heading 9 Char"/>
-    <w:basedOn w:val="DefaultParagraphFont"/>
-    <w:link w:val="Heading9"/>
-    <w:uiPriority w:val="9"/>
-    <w:semiHidden/>
-    <w:rsid w:val="00A10FD9"/>
-    <w:rPr>
-      <w:rFonts w:cstheme="majorBidi" w:eastAsiaTheme="majorEastAsia"/>
-      <w:color w:themeColor="text1" w:themeTint="D8" w:val="272727"/>
+      <w:color w:themeColor="accent1" w:val="4F81BD"/>
+      <w:sz w:val="24"/>
+      <w:szCs w:val="24"/>
     </w:rPr>
   </w:style>
   <w:style w:styleId="BlockText" w:type="paragraph">
@@ -3919,18 +4158,6 @@
     <w:uiPriority w:val="9"/>
     <w:unhideWhenUsed/>
     <w:qFormat/>
-  </w:style>
-  <w:style w:styleId="FootnoteBlockText" w:type="paragraph">
-    <w:name w:val="Footnote Block Text"/>
-    <w:basedOn w:val="FootnoteText"/>
-    <w:next w:val="FootnoteText"/>
-    <w:uiPriority w:val="9"/>
-    <w:unhideWhenUsed/>
-    <w:qFormat/>
-    <w:pPr>
-      <w:spacing w:after="100" w:before="100"/>
-      <w:ind w:firstLine="0" w:left="480" w:right="480"/>
-    </w:pPr>
   </w:style>
   <w:style w:default="1" w:styleId="DefaultParagraphFont" w:type="character">
     <w:name w:val="Default Paragraph Font"/>
@@ -3953,11 +4180,18 @@
       </w:tblCellMar>
     </w:tblPr>
     <w:tblStylePr w:type="firstRow">
+      <w:tblPr>
+        <w:jc w:val="left"/>
+        <w:tblInd w:type="dxa" w:w="0"/>
+      </w:tblPr>
+      <w:trPr>
+        <w:jc w:val="left"/>
+      </w:trPr>
       <w:tcPr>
+        <w:vAlign w:val="bottom"/>
         <w:tcBorders>
           <w:bottom w:val="single"/>
         </w:tcBorders>
-        <w:vAlign w:val="bottom"/>
       </w:tcPr>
     </w:tblStylePr>
   </w:style>
@@ -4072,8 +4306,8 @@
     <w:name w:val="KeywordTok"/>
     <w:basedOn w:val="VerbatimChar"/>
     <w:rPr>
+      <w:color w:val="007020"/>
       <w:b/>
-      <w:color w:val="007020"/>
     </w:rPr>
   </w:style>
   <w:style w:type="character" w:customStyle="1" w:styleId="DataTypeTok">
@@ -4150,42 +4384,42 @@
     <w:name w:val="ImportTok"/>
     <w:basedOn w:val="VerbatimChar"/>
     <w:rPr>
+      <w:color w:val="008000"/>
       <w:b/>
-      <w:color w:val="008000"/>
     </w:rPr>
   </w:style>
   <w:style w:type="character" w:customStyle="1" w:styleId="CommentTok">
     <w:name w:val="CommentTok"/>
     <w:basedOn w:val="VerbatimChar"/>
     <w:rPr>
+      <w:color w:val="60a0b0"/>
       <w:i/>
-      <w:color w:val="60a0b0"/>
     </w:rPr>
   </w:style>
   <w:style w:type="character" w:customStyle="1" w:styleId="DocumentationTok">
     <w:name w:val="DocumentationTok"/>
     <w:basedOn w:val="VerbatimChar"/>
     <w:rPr>
+      <w:color w:val="ba2121"/>
       <w:i/>
-      <w:color w:val="ba2121"/>
     </w:rPr>
   </w:style>
   <w:style w:type="character" w:customStyle="1" w:styleId="AnnotationTok">
     <w:name w:val="AnnotationTok"/>
     <w:basedOn w:val="VerbatimChar"/>
     <w:rPr>
+      <w:color w:val="60a0b0"/>
       <w:b/>
       <w:i/>
-      <w:color w:val="60a0b0"/>
     </w:rPr>
   </w:style>
   <w:style w:type="character" w:customStyle="1" w:styleId="CommentVarTok">
     <w:name w:val="CommentVarTok"/>
     <w:basedOn w:val="VerbatimChar"/>
     <w:rPr>
+      <w:color w:val="60a0b0"/>
       <w:b/>
       <w:i/>
-      <w:color w:val="60a0b0"/>
     </w:rPr>
   </w:style>
   <w:style w:type="character" w:customStyle="1" w:styleId="OtherTok">
@@ -4213,8 +4447,8 @@
     <w:name w:val="ControlFlowTok"/>
     <w:basedOn w:val="VerbatimChar"/>
     <w:rPr>
+      <w:color w:val="007020"/>
       <w:b/>
-      <w:color w:val="007020"/>
     </w:rPr>
   </w:style>
   <w:style w:type="character" w:customStyle="1" w:styleId="OperatorTok">
@@ -4259,34 +4493,34 @@
     <w:name w:val="InformationTok"/>
     <w:basedOn w:val="VerbatimChar"/>
     <w:rPr>
+      <w:color w:val="60a0b0"/>
       <w:b/>
       <w:i/>
-      <w:color w:val="60a0b0"/>
     </w:rPr>
   </w:style>
   <w:style w:type="character" w:customStyle="1" w:styleId="WarningTok">
     <w:name w:val="WarningTok"/>
     <w:basedOn w:val="VerbatimChar"/>
     <w:rPr>
+      <w:color w:val="60a0b0"/>
       <w:b/>
       <w:i/>
-      <w:color w:val="60a0b0"/>
     </w:rPr>
   </w:style>
   <w:style w:type="character" w:customStyle="1" w:styleId="AlertTok">
     <w:name w:val="AlertTok"/>
     <w:basedOn w:val="VerbatimChar"/>
     <w:rPr>
+      <w:color w:val="ff0000"/>
       <w:b/>
-      <w:color w:val="ff0000"/>
     </w:rPr>
   </w:style>
   <w:style w:type="character" w:customStyle="1" w:styleId="ErrorTok">
     <w:name w:val="ErrorTok"/>
     <w:basedOn w:val="VerbatimChar"/>
     <w:rPr>
+      <w:color w:val="ff0000"/>
       <w:b/>
-      <w:color w:val="ff0000"/>
     </w:rPr>
   </w:style>
   <w:style w:type="character" w:customStyle="1" w:styleId="NormalTok">
@@ -4308,44 +4542,44 @@
         <a:sysClr val="window" lastClr="FFFFFF"/>
       </a:lt1>
       <a:dk2>
-        <a:srgbClr val="0E2841"/>
+        <a:srgbClr val="1F497D"/>
       </a:dk2>
       <a:lt2>
-        <a:srgbClr val="E8E8E8"/>
+        <a:srgbClr val="EEECE1"/>
       </a:lt2>
       <a:accent1>
-        <a:srgbClr val="156082"/>
+        <a:srgbClr val="4F81BD"/>
       </a:accent1>
       <a:accent2>
-        <a:srgbClr val="E97132"/>
+        <a:srgbClr val="C0504D"/>
       </a:accent2>
       <a:accent3>
-        <a:srgbClr val="196B24"/>
+        <a:srgbClr val="9BBB59"/>
       </a:accent3>
       <a:accent4>
-        <a:srgbClr val="0F9ED5"/>
+        <a:srgbClr val="8064A2"/>
       </a:accent4>
       <a:accent5>
-        <a:srgbClr val="A02B93"/>
+        <a:srgbClr val="4BACC6"/>
       </a:accent5>
       <a:accent6>
-        <a:srgbClr val="4EA72E"/>
+        <a:srgbClr val="F79646"/>
       </a:accent6>
       <a:hlink>
-        <a:srgbClr val="467886"/>
+        <a:srgbClr val="0000FF"/>
       </a:hlink>
       <a:folHlink>
-        <a:srgbClr val="96607D"/>
+        <a:srgbClr val="800080"/>
       </a:folHlink>
     </a:clrScheme>
     <a:fontScheme name="Office">
       <a:majorFont>
-        <a:latin typeface="Aptos Display" panose="02110004020202020204"/>
+        <a:latin typeface="Calibri"/>
         <a:ea typeface=""/>
         <a:cs typeface=""/>
-        <a:font script="Jpan" typeface="游ゴシック Light"/>
+        <a:font script="Jpan" typeface="ＭＳ ゴシック"/>
         <a:font script="Hang" typeface="맑은 고딕"/>
-        <a:font script="Hans" typeface="等线 Light"/>
+        <a:font script="Hans" typeface="宋体"/>
         <a:font script="Hant" typeface="新細明體"/>
         <a:font script="Arab" typeface="Times New Roman"/>
         <a:font script="Hebr" typeface="Times New Roman"/>
@@ -4372,32 +4606,14 @@
         <a:font script="Mong" typeface="Mongolian Baiti"/>
         <a:font script="Viet" typeface="Times New Roman"/>
         <a:font script="Uigh" typeface="Microsoft Uighur"/>
-        <a:font script="Geor" typeface="Sylfaen"/>
-        <a:font script="Armn" typeface="Arial"/>
-        <a:font script="Bugi" typeface="Leelawadee UI"/>
-        <a:font script="Bopo" typeface="Microsoft JhengHei"/>
-        <a:font script="Java" typeface="Javanese Text"/>
-        <a:font script="Lisu" typeface="Segoe UI"/>
-        <a:font script="Mymr" typeface="Myanmar Text"/>
-        <a:font script="Nkoo" typeface="Ebrima"/>
-        <a:font script="Olck" typeface="Nirmala UI"/>
-        <a:font script="Osma" typeface="Ebrima"/>
-        <a:font script="Phag" typeface="Phagspa"/>
-        <a:font script="Syrn" typeface="Estrangelo Edessa"/>
-        <a:font script="Syrj" typeface="Estrangelo Edessa"/>
-        <a:font script="Syre" typeface="Estrangelo Edessa"/>
-        <a:font script="Sora" typeface="Nirmala UI"/>
-        <a:font script="Tale" typeface="Microsoft Tai Le"/>
-        <a:font script="Talu" typeface="Microsoft New Tai Lue"/>
-        <a:font script="Tfng" typeface="Ebrima"/>
       </a:majorFont>
       <a:minorFont>
-        <a:latin typeface="Aptos" panose="02110004020202020204"/>
+        <a:latin typeface="Cambria"/>
         <a:ea typeface=""/>
         <a:cs typeface=""/>
-        <a:font script="Jpan" typeface="游明朝"/>
+        <a:font script="Jpan" typeface="ＭＳ 明朝"/>
         <a:font script="Hang" typeface="맑은 고딕"/>
-        <a:font script="Hans" typeface="等线"/>
+        <a:font script="Hans" typeface="宋体"/>
         <a:font script="Hant" typeface="新細明體"/>
         <a:font script="Arab" typeface="Arial"/>
         <a:font script="Hebr" typeface="Arial"/>
@@ -4424,24 +4640,6 @@
         <a:font script="Mong" typeface="Mongolian Baiti"/>
         <a:font script="Viet" typeface="Arial"/>
         <a:font script="Uigh" typeface="Microsoft Uighur"/>
-        <a:font script="Geor" typeface="Sylfaen"/>
-        <a:font script="Armn" typeface="Arial"/>
-        <a:font script="Bugi" typeface="Leelawadee UI"/>
-        <a:font script="Bopo" typeface="Microsoft JhengHei"/>
-        <a:font script="Java" typeface="Javanese Text"/>
-        <a:font script="Lisu" typeface="Segoe UI"/>
-        <a:font script="Mymr" typeface="Myanmar Text"/>
-        <a:font script="Nkoo" typeface="Ebrima"/>
-        <a:font script="Olck" typeface="Nirmala UI"/>
-        <a:font script="Osma" typeface="Ebrima"/>
-        <a:font script="Phag" typeface="Phagspa"/>
-        <a:font script="Syrn" typeface="Estrangelo Edessa"/>
-        <a:font script="Syrj" typeface="Estrangelo Edessa"/>
-        <a:font script="Syre" typeface="Estrangelo Edessa"/>
-        <a:font script="Sora" typeface="Nirmala UI"/>
-        <a:font script="Tale" typeface="Microsoft Tai Le"/>
-        <a:font script="Talu" typeface="Microsoft New Tai Lue"/>
-        <a:font script="Tfng" typeface="Ebrima"/>
       </a:minorFont>
     </a:fontScheme>
     <a:fmtScheme name="Office">
@@ -4453,141 +4651,200 @@
           <a:gsLst>
             <a:gs pos="0">
               <a:schemeClr val="phClr">
-                <a:lumMod val="110000"/>
-                <a:satMod val="105000"/>
-                <a:tint val="67000"/>
+                <a:tint val="50000"/>
+                <a:satMod val="300000"/>
               </a:schemeClr>
             </a:gs>
-            <a:gs pos="50000">
+            <a:gs pos="35000">
               <a:schemeClr val="phClr">
-                <a:lumMod val="105000"/>
-                <a:satMod val="103000"/>
-                <a:tint val="73000"/>
+                <a:tint val="37000"/>
+                <a:satMod val="300000"/>
               </a:schemeClr>
             </a:gs>
             <a:gs pos="100000">
               <a:schemeClr val="phClr">
-                <a:lumMod val="105000"/>
-                <a:satMod val="109000"/>
-                <a:tint val="81000"/>
+                <a:tint val="15000"/>
+                <a:satMod val="350000"/>
               </a:schemeClr>
             </a:gs>
           </a:gsLst>
-          <a:lin ang="5400000" scaled="0"/>
+          <a:lin ang="16200000" scaled="1"/>
         </a:gradFill>
         <a:gradFill rotWithShape="1">
           <a:gsLst>
             <a:gs pos="0">
               <a:schemeClr val="phClr">
-                <a:satMod val="103000"/>
-                <a:lumMod val="102000"/>
-                <a:tint val="94000"/>
-              </a:schemeClr>
-            </a:gs>
-            <a:gs pos="50000">
-              <a:schemeClr val="phClr">
-                <a:satMod val="110000"/>
-                <a:lumMod val="100000"/>
+                <a:tint val="100000"/>
                 <a:shade val="100000"/>
+                <a:satMod val="130000"/>
               </a:schemeClr>
             </a:gs>
             <a:gs pos="100000">
               <a:schemeClr val="phClr">
-                <a:lumMod val="99000"/>
-                <a:satMod val="120000"/>
-                <a:shade val="78000"/>
+                <a:tint val="50000"/>
+                <a:shade val="100000"/>
+                <a:satMod val="350000"/>
               </a:schemeClr>
             </a:gs>
           </a:gsLst>
-          <a:lin ang="5400000" scaled="0"/>
+          <a:lin ang="16200000" scaled="0"/>
         </a:gradFill>
       </a:fillStyleLst>
       <a:lnStyleLst>
-        <a:ln w="6350" cap="flat" cmpd="sng" algn="ctr">
+        <a:ln w="9525" cap="flat" cmpd="sng" algn="ctr">
+          <a:solidFill>
+            <a:schemeClr val="phClr">
+              <a:shade val="95000"/>
+              <a:satMod val="105000"/>
+            </a:schemeClr>
+          </a:solidFill>
+          <a:prstDash val="solid"/>
+        </a:ln>
+        <a:ln w="25400" cap="flat" cmpd="sng" algn="ctr">
           <a:solidFill>
             <a:schemeClr val="phClr"/>
           </a:solidFill>
           <a:prstDash val="solid"/>
-          <a:miter lim="800000"/>
         </a:ln>
-        <a:ln w="12700" cap="flat" cmpd="sng" algn="ctr">
+        <a:ln w="38100" cap="flat" cmpd="sng" algn="ctr">
           <a:solidFill>
             <a:schemeClr val="phClr"/>
           </a:solidFill>
           <a:prstDash val="solid"/>
-          <a:miter lim="800000"/>
-        </a:ln>
-        <a:ln w="19050" cap="flat" cmpd="sng" algn="ctr">
-          <a:solidFill>
-            <a:schemeClr val="phClr"/>
-          </a:solidFill>
-          <a:prstDash val="solid"/>
-          <a:miter lim="800000"/>
         </a:ln>
       </a:lnStyleLst>
       <a:effectStyleLst>
         <a:effectStyle>
-          <a:effectLst/>
-        </a:effectStyle>
-        <a:effectStyle>
-          <a:effectLst/>
+          <a:effectLst>
+            <a:outerShdw blurRad="40000" dist="20000" dir="5400000" rotWithShape="0">
+              <a:srgbClr val="000000">
+                <a:alpha val="38000"/>
+              </a:srgbClr>
+            </a:outerShdw>
+          </a:effectLst>
         </a:effectStyle>
         <a:effectStyle>
           <a:effectLst>
-            <a:outerShdw blurRad="57150" dist="19050" dir="5400000" algn="ctr" rotWithShape="0">
+            <a:outerShdw blurRad="40000" dist="23000" dir="5400000" rotWithShape="0">
               <a:srgbClr val="000000">
-                <a:alpha val="63000"/>
+                <a:alpha val="35000"/>
               </a:srgbClr>
             </a:outerShdw>
           </a:effectLst>
+        </a:effectStyle>
+        <a:effectStyle>
+          <a:effectLst>
+            <a:outerShdw blurRad="40000" dist="23000" dir="5400000" rotWithShape="0">
+              <a:srgbClr val="000000">
+                <a:alpha val="35000"/>
+              </a:srgbClr>
+            </a:outerShdw>
+          </a:effectLst>
+          <a:scene3d>
+            <a:camera prst="orthographicFront">
+              <a:rot lat="0" lon="0" rev="0"/>
+            </a:camera>
+            <a:lightRig rig="threePt" dir="t">
+              <a:rot lat="0" lon="0" rev="1200000"/>
+            </a:lightRig>
+          </a:scene3d>
+          <a:sp3d>
+            <a:bevelT w="63500" h="25400"/>
+          </a:sp3d>
         </a:effectStyle>
       </a:effectStyleLst>
       <a:bgFillStyleLst>
         <a:solidFill>
           <a:schemeClr val="phClr"/>
         </a:solidFill>
-        <a:solidFill>
-          <a:schemeClr val="phClr">
-            <a:tint val="95000"/>
-            <a:satMod val="170000"/>
-          </a:schemeClr>
-        </a:solidFill>
         <a:gradFill rotWithShape="1">
           <a:gsLst>
             <a:gs pos="0">
               <a:schemeClr val="phClr">
-                <a:tint val="93000"/>
-                <a:satMod val="150000"/>
-                <a:shade val="98000"/>
-                <a:lumMod val="102000"/>
+                <a:tint val="40000"/>
+                <a:satMod val="350000"/>
               </a:schemeClr>
             </a:gs>
-            <a:gs pos="50000">
+            <a:gs pos="40000">
               <a:schemeClr val="phClr">
-                <a:tint val="98000"/>
-                <a:satMod val="130000"/>
-                <a:shade val="90000"/>
-                <a:lumMod val="103000"/>
+                <a:tint val="45000"/>
+                <a:shade val="99000"/>
+                <a:satMod val="350000"/>
               </a:schemeClr>
             </a:gs>
             <a:gs pos="100000">
               <a:schemeClr val="phClr">
-                <a:shade val="63000"/>
-                <a:satMod val="120000"/>
+                <a:shade val="20000"/>
+                <a:satMod val="255000"/>
               </a:schemeClr>
             </a:gs>
           </a:gsLst>
-          <a:lin ang="5400000" scaled="0"/>
+          <a:path path="circle">
+            <a:fillToRect l="50000" t="-80000" r="50000" b="180000"/>
+          </a:path>
+        </a:gradFill>
+        <a:gradFill rotWithShape="1">
+          <a:gsLst>
+            <a:gs pos="0">
+              <a:schemeClr val="phClr">
+                <a:tint val="80000"/>
+                <a:satMod val="300000"/>
+              </a:schemeClr>
+            </a:gs>
+            <a:gs pos="100000">
+              <a:schemeClr val="phClr">
+                <a:shade val="30000"/>
+                <a:satMod val="200000"/>
+              </a:schemeClr>
+            </a:gs>
+          </a:gsLst>
+          <a:path path="circle">
+            <a:fillToRect l="50000" t="50000" r="50000" b="50000"/>
+          </a:path>
         </a:gradFill>
       </a:bgFillStyleLst>
     </a:fmtScheme>
   </a:themeElements>
-  <a:objectDefaults/>
+  <a:objectDefaults>
+    <a:spDef>
+      <a:spPr/>
+      <a:bodyPr/>
+      <a:lstStyle/>
+      <a:style>
+        <a:lnRef idx="1">
+          <a:schemeClr val="accent1"/>
+        </a:lnRef>
+        <a:fillRef idx="3">
+          <a:schemeClr val="accent1"/>
+        </a:fillRef>
+        <a:effectRef idx="2">
+          <a:schemeClr val="accent1"/>
+        </a:effectRef>
+        <a:fontRef idx="minor">
+          <a:schemeClr val="lt1"/>
+        </a:fontRef>
+      </a:style>
+    </a:spDef>
+    <a:lnDef>
+      <a:spPr/>
+      <a:bodyPr/>
+      <a:lstStyle/>
+      <a:style>
+        <a:lnRef idx="2">
+          <a:schemeClr val="accent1"/>
+        </a:lnRef>
+        <a:fillRef idx="0">
+          <a:schemeClr val="accent1"/>
+        </a:fillRef>
+        <a:effectRef idx="1">
+          <a:schemeClr val="accent1"/>
+        </a:effectRef>
+        <a:fontRef idx="minor">
+          <a:schemeClr val="tx1"/>
+        </a:fontRef>
+      </a:style>
+    </a:lnDef>
+  </a:objectDefaults>
   <a:extraClrSchemeLst/>
-  <a:extLst>
-    <a:ext uri="{05A4C25C-085E-4340-85A3-A5531E510DB2}">
-      <thm15:themeFamily xmlns:thm15="http://schemas.microsoft.com/office/thememl/2012/main" name="Office Theme" id="{2E142A2C-CD16-42D6-873A-C26D2A0506FA}" vid="{1BDDFF52-6CD6-40A5-AB3C-68EB2F1E4D0A}"/>
-    </a:ext>
-  </a:extLst>
 </a:theme>
 </file>
</xml_diff>